<commit_message>
Aktualizovat šablonu smlouvy - opravený řádek s názvy stran
Uživatel ručně opravil odstavec pro název smluvních stran v podpisovém
bloku - původní odstavec byl zbytek starého sloupcového zalomení
(w:br type="column"), ktere predchozi kod tise mazal pri prepisu
textu. Nova sablona ma misto toho 2 ciste runy (Pronajimatel/Najemce
s vlastnim tabulatorem) - kod upraven, aby do nich psal primo bez
kolabovani na jeden run.

Co-Authored-By: Claude Sonnet 5 <noreply@anthropic.com>
</commit_message>
<xml_diff>
--- a/core/contract_templates/smlouva_template.docx
+++ b/core/contract_templates/smlouva_template.docx
@@ -1824,8 +1824,6 @@
         </w:numPr>
         <w:rPr>
           <w:rFonts w:ascii="Arial Narrow" w:hAnsi="Arial Narrow" w:cs="Arial"/>
-          <w:b w:val="0"/>
-          <w:bCs w:val="0"/>
           <w:u w:val="single"/>
         </w:rPr>
       </w:pPr>
@@ -1833,8 +1831,6 @@
       <w:r>
         <w:rPr>
           <w:rFonts w:ascii="Arial Narrow" w:eastAsia="Arial Unicode MS" w:hAnsi="Arial Narrow" w:cs="Arial"/>
-          <w:b w:val="0"/>
-          <w:bCs w:val="0"/>
           <w:u w:val="single"/>
         </w:rPr>
         <w:lastRenderedPageBreak/>
@@ -2437,8 +2433,6 @@
         </w:numPr>
         <w:rPr>
           <w:rFonts w:ascii="Arial Narrow" w:hAnsi="Arial Narrow" w:cs="Arial"/>
-          <w:b w:val="0"/>
-          <w:bCs w:val="0"/>
           <w:u w:val="single"/>
         </w:rPr>
       </w:pPr>
@@ -2446,8 +2440,6 @@
       <w:r>
         <w:rPr>
           <w:rFonts w:ascii="Arial Narrow" w:eastAsia="Arial Unicode MS" w:hAnsi="Arial Narrow" w:cs="Arial"/>
-          <w:b w:val="0"/>
-          <w:bCs w:val="0"/>
           <w:u w:val="single"/>
         </w:rPr>
         <w:t>Nájemné</w:t>
@@ -2715,7 +2707,15 @@
           <w:sz w:val="16"/>
           <w:szCs w:val="16"/>
         </w:rPr>
-        <w:t>Pronajímatel je oprávněn poprvé upravit výši nájemného dle ustanovení odstavce 2.5 s účinností od 1. ledna 2027.</w:t>
+        <w:t xml:space="preserve">Pronajímatel je oprávněn poprvé upravit výši nájemného dle ustanovení odstavce 2.5 s účinností od </w:t>
+      </w:r>
+      <w:r>
+        <w:rPr>
+          <w:rFonts w:ascii="Arial Narrow" w:hAnsi="Arial Narrow" w:cs="Arial"/>
+          <w:sz w:val="16"/>
+          <w:highlight w:val="yellow"/>
+        </w:rPr>
+        <w:t>1. ledna 2027.</w:t>
       </w:r>
     </w:p>
     <w:p>
@@ -2737,8 +2737,6 @@
         </w:numPr>
         <w:rPr>
           <w:rFonts w:ascii="Arial Narrow" w:hAnsi="Arial Narrow" w:cs="Arial"/>
-          <w:b w:val="0"/>
-          <w:bCs w:val="0"/>
           <w:u w:val="single"/>
         </w:rPr>
       </w:pPr>
@@ -2746,8 +2744,6 @@
       <w:r>
         <w:rPr>
           <w:rFonts w:ascii="Arial Narrow" w:eastAsia="Arial Unicode MS" w:hAnsi="Arial Narrow" w:cs="Arial"/>
-          <w:b w:val="0"/>
-          <w:bCs w:val="0"/>
           <w:u w:val="single"/>
         </w:rPr>
         <w:t>Služby poskytované spolu s nájmem</w:t>
@@ -2969,8 +2965,6 @@
         </w:numPr>
         <w:rPr>
           <w:rFonts w:ascii="Arial Narrow" w:hAnsi="Arial Narrow" w:cs="Arial"/>
-          <w:b w:val="0"/>
-          <w:bCs w:val="0"/>
           <w:u w:val="single"/>
         </w:rPr>
       </w:pPr>
@@ -2978,8 +2972,6 @@
       <w:r>
         <w:rPr>
           <w:rFonts w:ascii="Arial Narrow" w:eastAsia="Arial Unicode MS" w:hAnsi="Arial Narrow" w:cs="Arial"/>
-          <w:b w:val="0"/>
-          <w:bCs w:val="0"/>
           <w:u w:val="single"/>
         </w:rPr>
         <w:lastRenderedPageBreak/>
@@ -3263,8 +3255,6 @@
         </w:numPr>
         <w:rPr>
           <w:rFonts w:ascii="Arial Narrow" w:hAnsi="Arial Narrow" w:cs="Arial"/>
-          <w:b w:val="0"/>
-          <w:bCs w:val="0"/>
           <w:u w:val="single"/>
         </w:rPr>
       </w:pPr>
@@ -3272,8 +3262,6 @@
       <w:r>
         <w:rPr>
           <w:rFonts w:ascii="Arial Narrow" w:eastAsia="Arial Unicode MS" w:hAnsi="Arial Narrow" w:cs="Arial"/>
-          <w:b w:val="0"/>
-          <w:bCs w:val="0"/>
           <w:u w:val="single"/>
         </w:rPr>
         <w:t>Další práva a povinnosti smluvních stran</w:t>
@@ -3788,7 +3776,7 @@
         <w:pStyle w:val="Text"/>
         <w:numPr>
           <w:ilvl w:val="0"/>
-          <w:numId w:val="20"/>
+          <w:numId w:val="40"/>
         </w:numPr>
         <w:jc w:val="both"/>
         <w:rPr>
@@ -3811,7 +3799,7 @@
         <w:pStyle w:val="Text"/>
         <w:numPr>
           <w:ilvl w:val="0"/>
-          <w:numId w:val="20"/>
+          <w:numId w:val="40"/>
         </w:numPr>
         <w:jc w:val="both"/>
         <w:rPr>
@@ -3834,7 +3822,7 @@
         <w:pStyle w:val="Text"/>
         <w:numPr>
           <w:ilvl w:val="0"/>
-          <w:numId w:val="20"/>
+          <w:numId w:val="40"/>
         </w:numPr>
         <w:jc w:val="both"/>
         <w:rPr>
@@ -3871,8 +3859,6 @@
         </w:numPr>
         <w:rPr>
           <w:rFonts w:ascii="Arial Narrow" w:hAnsi="Arial Narrow" w:cs="Arial"/>
-          <w:b w:val="0"/>
-          <w:bCs w:val="0"/>
           <w:u w:val="single"/>
         </w:rPr>
       </w:pPr>
@@ -3880,8 +3866,6 @@
       <w:r>
         <w:rPr>
           <w:rFonts w:ascii="Arial Narrow" w:eastAsia="Arial Unicode MS" w:hAnsi="Arial Narrow" w:cs="Arial"/>
-          <w:b w:val="0"/>
-          <w:bCs w:val="0"/>
           <w:u w:val="single"/>
         </w:rPr>
         <w:t>Úpravy, opravy a údržba</w:t>
@@ -4068,8 +4052,6 @@
         </w:numPr>
         <w:rPr>
           <w:rFonts w:ascii="Arial Narrow" w:hAnsi="Arial Narrow" w:cs="Arial"/>
-          <w:b w:val="0"/>
-          <w:bCs w:val="0"/>
           <w:u w:val="single"/>
         </w:rPr>
       </w:pPr>
@@ -4077,8 +4059,6 @@
       <w:r>
         <w:rPr>
           <w:rFonts w:ascii="Arial Narrow" w:eastAsia="Arial Unicode MS" w:hAnsi="Arial Narrow" w:cs="Arial"/>
-          <w:b w:val="0"/>
-          <w:bCs w:val="0"/>
           <w:u w:val="single"/>
         </w:rPr>
         <w:t>Trvání Smlouvy</w:t>
@@ -4115,7 +4095,23 @@
           <w:rFonts w:ascii="Arial Narrow" w:hAnsi="Arial Narrow" w:cs="Arial"/>
           <w:sz w:val="16"/>
         </w:rPr>
-        <w:t xml:space="preserve">Smluvní strany se dohodly, že nájem dle této Smlouvy se sjednává na dobu neurčitou, a to od </w:t>
+        <w:t xml:space="preserve">Smluvní strany se dohodly, že nájem dle této Smlouvy se sjednává na dobu </w:t>
+      </w:r>
+      <w:r>
+        <w:rPr>
+          <w:rFonts w:ascii="Arial Narrow" w:hAnsi="Arial Narrow" w:cs="Arial"/>
+          <w:b/>
+          <w:bCs/>
+          <w:sz w:val="16"/>
+        </w:rPr>
+        <w:t>neurčitou</w:t>
+      </w:r>
+      <w:r>
+        <w:rPr>
+          <w:rFonts w:ascii="Arial Narrow" w:hAnsi="Arial Narrow" w:cs="Arial"/>
+          <w:sz w:val="16"/>
+        </w:rPr>
+        <w:t xml:space="preserve">, a to od </w:t>
       </w:r>
       <w:r>
         <w:rPr>
@@ -4183,320 +4179,596 @@
         <w:pStyle w:val="Text"/>
         <w:numPr>
           <w:ilvl w:val="0"/>
-          <w:numId w:val="20"/>
-        </w:numPr>
-        <w:jc w:val="both"/>
-        <w:rPr>
-          <w:rFonts w:ascii="Arial Narrow" w:hAnsi="Arial Narrow" w:cs="Arial"/>
-          <w:sz w:val="16"/>
-          <w:szCs w:val="16"/>
-        </w:rPr>
-      </w:pPr>
-      <w:r>
-        <w:rPr>
-          <w:rFonts w:ascii="Arial Narrow" w:hAnsi="Arial Narrow" w:cs="Arial"/>
-          <w:sz w:val="16"/>
-        </w:rPr>
-        <w:t xml:space="preserve">Pronajímatel i nájemce mohou kdykoli Smlouvu vypovědět i bez udání důvodu. Výpovědní doba činí u výpovědi pronajímatele i nájemce shodně </w:t>
+          <w:numId w:val="26"/>
+        </w:numPr>
+        <w:jc w:val="both"/>
+        <w:rPr>
+          <w:rFonts w:ascii="Arial Narrow" w:hAnsi="Arial Narrow" w:cs="Arial"/>
+          <w:sz w:val="16"/>
+          <w:szCs w:val="16"/>
+        </w:rPr>
+      </w:pPr>
+      <w:r>
+        <w:rPr>
+          <w:rFonts w:ascii="Arial Narrow" w:hAnsi="Arial Narrow" w:cs="Arial"/>
+          <w:sz w:val="16"/>
+          <w:szCs w:val="16"/>
+        </w:rPr>
+        <w:t xml:space="preserve">Pronajímatel i nájemce mohou kdykoli Smlouvu vypovědět i bez udání důvodu. Výpovědní doba činí u výpovědi pronajímatele i nájemce shodně 3 měsíce a její běh začíná prvním dnem kalendářního měsíce bezprostředně následujícího po doručení výpovědi druhé smluvní straně. </w:t>
+      </w:r>
+    </w:p>
+    <w:p>
+      <w:pPr>
+        <w:pStyle w:val="Text"/>
+        <w:numPr>
+          <w:ilvl w:val="0"/>
+          <w:numId w:val="26"/>
+        </w:numPr>
+        <w:jc w:val="both"/>
+        <w:rPr>
+          <w:rFonts w:ascii="Arial Narrow" w:hAnsi="Arial Narrow" w:cs="Arial"/>
+          <w:sz w:val="16"/>
+          <w:szCs w:val="16"/>
+        </w:rPr>
+      </w:pPr>
+      <w:r>
+        <w:rPr>
+          <w:rFonts w:ascii="Arial Narrow" w:hAnsi="Arial Narrow" w:cs="Arial"/>
+          <w:sz w:val="16"/>
+          <w:szCs w:val="16"/>
+        </w:rPr>
+        <w:t>Pronajímatel však může tuto smlouvu vypovědět s výpovědní dobou v trvání 30 dnů ode dne doručení výpovědi nájemci z důvodů, že nájemce porušuje kterékoli z ustanovení odst. 5.2, 5.3, 5.4, 5.9, 5.13, 5.15, 5.17, 6.1 nebo 6.2 nebo že se nájemce dostal do prodlení delšího než 30 dnů s jakýmkoli peněžitým plněním podle Smlouvy nebo že nájemce nebo třetí osoby užívají Předmět nájmu způsobem odporujícím veřejnému pořádku nebo že bylo zahájeno proti nájemci jako dlužníkovi insolvenční řízení podle zákona č. 182/2006 Sb., insolvenčního zákona, ve znění pozdějších předpisů. V případě výpovědi dle tohoto písmene se ustanovení písmene (B) nepoužije.</w:t>
+      </w:r>
+    </w:p>
+    <w:p>
+      <w:pPr>
+        <w:pStyle w:val="Text"/>
+        <w:numPr>
+          <w:ilvl w:val="0"/>
+          <w:numId w:val="25"/>
+        </w:numPr>
+        <w:jc w:val="both"/>
+        <w:rPr>
+          <w:rFonts w:ascii="Arial Narrow" w:hAnsi="Arial Narrow" w:cs="Arial"/>
+          <w:sz w:val="16"/>
+        </w:rPr>
+      </w:pPr>
+      <w:r>
+        <w:rPr>
+          <w:rFonts w:ascii="Arial Narrow" w:hAnsi="Arial Narrow" w:cs="Arial"/>
+          <w:sz w:val="16"/>
+        </w:rPr>
+        <w:t xml:space="preserve">Nájemce se tímto vzdává svého práva vznést proti výpovědi námitky ve smyslu § 2314 občanského zákoníku. </w:t>
+      </w:r>
+    </w:p>
+    <w:p>
+      <w:pPr>
+        <w:pStyle w:val="Text"/>
+        <w:numPr>
+          <w:ilvl w:val="0"/>
+          <w:numId w:val="25"/>
+        </w:numPr>
+        <w:jc w:val="both"/>
+        <w:rPr>
+          <w:rFonts w:ascii="Arial Narrow" w:hAnsi="Arial Narrow" w:cs="Arial"/>
+          <w:sz w:val="16"/>
+        </w:rPr>
+      </w:pPr>
+      <w:r>
+        <w:rPr>
+          <w:rFonts w:ascii="Arial Narrow" w:hAnsi="Arial Narrow" w:cs="Arial"/>
+          <w:sz w:val="16"/>
+        </w:rPr>
+        <w:t>Ke dni ukončení nájemního vztahu z této Smlouvy se nájemce zavazuje vypořádat veškeré závazky vyplývající ze Smlouvy a to především:</w:t>
+      </w:r>
+    </w:p>
+    <w:p>
+      <w:pPr>
+        <w:pStyle w:val="Text"/>
+        <w:numPr>
+          <w:ilvl w:val="0"/>
+          <w:numId w:val="27"/>
+        </w:numPr>
+        <w:jc w:val="both"/>
+        <w:rPr>
+          <w:rFonts w:ascii="Arial Narrow" w:hAnsi="Arial Narrow" w:cs="Arial"/>
+          <w:sz w:val="16"/>
+          <w:szCs w:val="16"/>
+        </w:rPr>
+      </w:pPr>
+      <w:r>
+        <w:rPr>
+          <w:rFonts w:ascii="Arial Narrow" w:hAnsi="Arial Narrow" w:cs="Arial"/>
+          <w:sz w:val="16"/>
+          <w:szCs w:val="16"/>
+        </w:rPr>
+        <w:t>vrátit pronajímateli Předmět nájmu včetně příslušenství v takovém stavu, v jakém mu byl předán</w:t>
+      </w:r>
+      <w:r>
+        <w:rPr>
+          <w:rFonts w:ascii="Arial Narrow" w:eastAsia="Helvetica Neue Thin" w:hAnsi="Arial Narrow" w:cs="Arial"/>
+          <w:sz w:val="16"/>
+          <w:szCs w:val="16"/>
+        </w:rPr>
+        <w:t xml:space="preserve"> </w:t>
+      </w:r>
+      <w:r>
+        <w:rPr>
+          <w:rFonts w:ascii="Arial Narrow" w:hAnsi="Arial Narrow" w:cs="Arial"/>
+          <w:sz w:val="16"/>
+          <w:szCs w:val="16"/>
+        </w:rPr>
+        <w:t>(s ohledem k běžnému opotřebení); o tom bude sepsán předávací protokol,</w:t>
+      </w:r>
+    </w:p>
+    <w:p>
+      <w:pPr>
+        <w:pStyle w:val="Text"/>
+        <w:numPr>
+          <w:ilvl w:val="0"/>
+          <w:numId w:val="27"/>
+        </w:numPr>
+        <w:jc w:val="both"/>
+        <w:rPr>
+          <w:rFonts w:ascii="Arial Narrow" w:hAnsi="Arial Narrow" w:cs="Arial"/>
+          <w:sz w:val="16"/>
+          <w:szCs w:val="16"/>
+        </w:rPr>
+      </w:pPr>
+      <w:r>
+        <w:rPr>
+          <w:rFonts w:ascii="Arial Narrow" w:hAnsi="Arial Narrow" w:cs="Arial"/>
+          <w:sz w:val="16"/>
+          <w:szCs w:val="16"/>
+        </w:rPr>
+        <w:t>vyrovnat finanční závazky vyplývající ze Smlouvy,</w:t>
+      </w:r>
+    </w:p>
+    <w:p>
+      <w:pPr>
+        <w:pStyle w:val="Text"/>
+        <w:numPr>
+          <w:ilvl w:val="0"/>
+          <w:numId w:val="27"/>
+        </w:numPr>
+        <w:jc w:val="both"/>
+        <w:rPr>
+          <w:rFonts w:ascii="Arial Narrow" w:hAnsi="Arial Narrow" w:cs="Arial"/>
+          <w:sz w:val="16"/>
+          <w:szCs w:val="16"/>
+        </w:rPr>
+      </w:pPr>
+      <w:r>
+        <w:rPr>
+          <w:rFonts w:ascii="Arial Narrow" w:hAnsi="Arial Narrow" w:cs="Arial"/>
+          <w:sz w:val="16"/>
+          <w:szCs w:val="16"/>
+        </w:rPr>
+        <w:t>vymalovat pronajaté prostory,</w:t>
+      </w:r>
+    </w:p>
+    <w:p>
+      <w:pPr>
+        <w:pStyle w:val="Text"/>
+        <w:numPr>
+          <w:ilvl w:val="0"/>
+          <w:numId w:val="27"/>
+        </w:numPr>
+        <w:jc w:val="both"/>
+        <w:rPr>
+          <w:rFonts w:ascii="Arial Narrow" w:hAnsi="Arial Narrow" w:cs="Arial"/>
+          <w:sz w:val="16"/>
+          <w:szCs w:val="16"/>
+        </w:rPr>
+      </w:pPr>
+      <w:r>
+        <w:rPr>
+          <w:rFonts w:ascii="Arial Narrow" w:hAnsi="Arial Narrow" w:cs="Arial"/>
+          <w:sz w:val="16"/>
+          <w:szCs w:val="16"/>
+        </w:rPr>
+        <w:t>opravit a v případě většího poškození vyměnit podlahovou krytinu.</w:t>
+      </w:r>
+    </w:p>
+    <w:p>
+      <w:pPr>
+        <w:pStyle w:val="Text"/>
+        <w:numPr>
+          <w:ilvl w:val="0"/>
+          <w:numId w:val="25"/>
+        </w:numPr>
+        <w:jc w:val="both"/>
+        <w:rPr>
+          <w:rFonts w:ascii="Arial Narrow" w:hAnsi="Arial Narrow" w:cs="Arial"/>
+          <w:sz w:val="16"/>
+        </w:rPr>
+      </w:pPr>
+      <w:r>
+        <w:rPr>
+          <w:rFonts w:ascii="Arial Narrow" w:hAnsi="Arial Narrow" w:cs="Arial"/>
+          <w:sz w:val="16"/>
+        </w:rPr>
+        <w:t>Smluvní strany ujednávají, že v případě, že z jakéhokoli důvodu skončí nájemní vztah dle této Smlouvy a nájemce ani po jeho skončení přes písemnou výzvu pronajímatele, aby Nemovitosti vyklidil ve lhůtě alespoň 3 kalendářních dnů od doručení výzvy, Nemovitosti nevyklidí a pronajímateli vyklizené nepředá, je pronajímatel oprávněn znepřístupnit nájemci Předmět nájmu a dále sám nebo pomocí třetí osoby na náklady nájemce a na jeho nebezpečí vyklidit Nemovitosti. V takovém případě je pronajímatel oprávněn veškeré věci, které v Nemovitostech nájemce zanechal, uskladnit na náklady nájemce a na jeho nebezpečí u kterékoli třetí osoby nebo ve vlastních prostorách. Nájemce k tomuto postupu uděluje pronajímateli výslovný, jednostranně neodvolatelný souhlas. Současně nájemce zmocňuje pronajímatele, aby v případě, že pronajímatel využije svého oprávnění dle věty druhé a nájemce po dobu tří měsíců od uskladnění vyklizených věcí nevyzve pronajímatele k vydání uvedených věcí či tyto nepřevezme, prodal pronajímatel jménem nájemce a na jeho účet veškeré takto uskladněné věci kterékoli třetí osobě. Výtěžek prodeje uvedených věcí je pronajímatel oprávněn v plném rozsahu započíst vůči jakékoli své pohledávce za nájemcem, včetně pohledávky z titulu ceny znepřístupnění Předmětu nájmu a ceny uskladnění těchto věcí.</w:t>
+      </w:r>
+    </w:p>
+    <w:p>
+      <w:pPr>
+        <w:pStyle w:val="Text"/>
+        <w:numPr>
+          <w:ilvl w:val="0"/>
+          <w:numId w:val="25"/>
+        </w:numPr>
+        <w:jc w:val="both"/>
+        <w:rPr>
+          <w:rFonts w:ascii="Arial Narrow" w:hAnsi="Arial Narrow" w:cs="Arial"/>
+          <w:sz w:val="16"/>
+        </w:rPr>
+      </w:pPr>
+      <w:r>
+        <w:rPr>
+          <w:rFonts w:ascii="Arial Narrow" w:hAnsi="Arial Narrow" w:cs="Arial"/>
+          <w:sz w:val="16"/>
+        </w:rPr>
+        <w:t>Smluvní strany se dohodly, že nájemce nemá, zejména s ohledem na povahu podnikatelské činnosti nájemce, resp. povahu Předmětu nájmu, právo na náhradu za převzetí zákaznické základny ve smyslu § 2315 občanského zákoníku.</w:t>
+      </w:r>
+    </w:p>
+    <w:p>
+      <w:pPr>
+        <w:pStyle w:val="Text"/>
+        <w:numPr>
+          <w:ilvl w:val="0"/>
+          <w:numId w:val="25"/>
+        </w:numPr>
+        <w:jc w:val="both"/>
+        <w:rPr>
+          <w:rFonts w:ascii="Arial Narrow" w:hAnsi="Arial Narrow" w:cs="Arial"/>
+          <w:sz w:val="16"/>
+        </w:rPr>
+      </w:pPr>
+      <w:r>
+        <w:rPr>
+          <w:rFonts w:ascii="Arial Narrow" w:hAnsi="Arial Narrow" w:cs="Arial"/>
+          <w:sz w:val="16"/>
+        </w:rPr>
+        <w:t>Smluvní strany dále vylučují aplikaci ustanovení § 2230 občanského zákoníku.</w:t>
+      </w:r>
+    </w:p>
+    <w:p>
+      <w:pPr>
+        <w:pStyle w:val="Text"/>
+        <w:numPr>
+          <w:ilvl w:val="0"/>
+          <w:numId w:val="25"/>
+        </w:numPr>
+        <w:jc w:val="both"/>
+        <w:rPr>
+          <w:rFonts w:ascii="Arial Narrow" w:hAnsi="Arial Narrow" w:cs="Arial"/>
+          <w:sz w:val="16"/>
+        </w:rPr>
+      </w:pPr>
+      <w:r>
+        <w:rPr>
+          <w:rFonts w:ascii="Arial Narrow" w:hAnsi="Arial Narrow" w:cs="Arial"/>
+          <w:sz w:val="16"/>
+        </w:rPr>
+        <w:t xml:space="preserve">Nájemce není oprávněn požadovat zrušení Smlouvy pro změnu okolností a ve smyslu § 2000 odst. 2 občanského zákoníku se tímto vzdává svého práva </w:t>
+      </w:r>
+      <w:proofErr w:type="gramStart"/>
+      <w:r>
+        <w:rPr>
+          <w:rFonts w:ascii="Arial Narrow" w:hAnsi="Arial Narrow" w:cs="Arial"/>
+          <w:sz w:val="16"/>
+        </w:rPr>
+        <w:t>se</w:t>
+      </w:r>
+      <w:proofErr w:type="gramEnd"/>
+      <w:r>
+        <w:rPr>
+          <w:rFonts w:ascii="Arial Narrow" w:hAnsi="Arial Narrow" w:cs="Arial"/>
+          <w:sz w:val="16"/>
+        </w:rPr>
+        <w:t xml:space="preserve"> zrušení Smlouvy domáhat.</w:t>
+      </w:r>
+    </w:p>
+    <w:p>
+      <w:pPr>
+        <w:pStyle w:val="Text"/>
+        <w:rPr>
+          <w:rFonts w:ascii="Arial Narrow" w:eastAsia="Helvetica Neue Thin" w:hAnsi="Arial Narrow" w:cs="Arial"/>
+          <w:sz w:val="16"/>
+          <w:szCs w:val="16"/>
+        </w:rPr>
+      </w:pPr>
+    </w:p>
+    <w:p>
+      <w:pPr>
+        <w:pStyle w:val="Nadpis"/>
+        <w:numPr>
+          <w:ilvl w:val="0"/>
+          <w:numId w:val="16"/>
+        </w:numPr>
+        <w:rPr>
+          <w:rFonts w:ascii="Arial Narrow" w:hAnsi="Arial Narrow" w:cs="Arial"/>
+          <w:u w:val="single"/>
+        </w:rPr>
+      </w:pPr>
+      <w:bookmarkStart w:id="7" w:name="_Toc7"/>
+      <w:r>
+        <w:rPr>
+          <w:rFonts w:ascii="Arial Narrow" w:eastAsia="Arial Unicode MS" w:hAnsi="Arial Narrow" w:cs="Arial"/>
+          <w:u w:val="single"/>
+        </w:rPr>
+        <w:t>Sankce a náhrada škody</w:t>
+      </w:r>
+      <w:bookmarkEnd w:id="7"/>
+    </w:p>
+    <w:p>
+      <w:pPr>
+        <w:pStyle w:val="Text"/>
+        <w:rPr>
+          <w:rFonts w:ascii="Arial Narrow" w:hAnsi="Arial Narrow" w:cs="Arial"/>
+          <w:sz w:val="16"/>
+          <w:szCs w:val="16"/>
+        </w:rPr>
+      </w:pPr>
+    </w:p>
+    <w:p>
+      <w:pPr>
+        <w:pStyle w:val="Text"/>
+        <w:numPr>
+          <w:ilvl w:val="0"/>
+          <w:numId w:val="28"/>
+        </w:numPr>
+        <w:jc w:val="both"/>
+        <w:rPr>
+          <w:rFonts w:ascii="Arial Narrow" w:hAnsi="Arial Narrow" w:cs="Arial"/>
+          <w:sz w:val="16"/>
+          <w:szCs w:val="16"/>
+        </w:rPr>
+      </w:pPr>
+      <w:r>
+        <w:rPr>
+          <w:rFonts w:ascii="Arial Narrow" w:hAnsi="Arial Narrow" w:cs="Arial"/>
+          <w:sz w:val="16"/>
+          <w:szCs w:val="16"/>
+        </w:rPr>
+        <w:t xml:space="preserve">Nájemce je povinen zaplatit pronajímateli smluvní pokutu ve výši 100 Kč denně za každé jednotlivé porušení kterékoli z povinností stanovených odst. 5.2, 5.3, 5.4, 5.9, 5.10, 5.13, 5.14, 5.15, 5.17, 6.1 nebo 6.2 Smlouvy, a to až do sjednání nápravy. </w:t>
+      </w:r>
+    </w:p>
+    <w:p>
+      <w:pPr>
+        <w:pStyle w:val="Text"/>
+        <w:numPr>
+          <w:ilvl w:val="0"/>
+          <w:numId w:val="28"/>
+        </w:numPr>
+        <w:jc w:val="both"/>
+        <w:rPr>
+          <w:rFonts w:ascii="Arial Narrow" w:hAnsi="Arial Narrow" w:cs="Arial"/>
+          <w:sz w:val="16"/>
+          <w:szCs w:val="16"/>
+        </w:rPr>
+      </w:pPr>
+      <w:r>
+        <w:rPr>
+          <w:rFonts w:ascii="Arial Narrow" w:hAnsi="Arial Narrow" w:cs="Arial"/>
+          <w:sz w:val="16"/>
+          <w:szCs w:val="16"/>
+        </w:rPr>
+        <w:t xml:space="preserve">Nájemce je povinen zaplatit pronajímateli smluvní pokutu ve výši </w:t>
+      </w:r>
+      <w:r>
+        <w:rPr>
+          <w:rFonts w:ascii="Arial Narrow" w:hAnsi="Arial Narrow" w:cs="Arial"/>
+          <w:sz w:val="16"/>
+          <w:szCs w:val="16"/>
+        </w:rPr>
+        <w:t>0,1 %</w:t>
+      </w:r>
+      <w:r>
+        <w:rPr>
+          <w:rFonts w:ascii="Arial Narrow" w:hAnsi="Arial Narrow" w:cs="Arial"/>
+          <w:sz w:val="16"/>
+          <w:szCs w:val="16"/>
+        </w:rPr>
+        <w:t xml:space="preserve"> z výše dlužné částky za každý den prodlení s placením jakéhokoli peněžitého dluhu dle této Smlouvy.</w:t>
+      </w:r>
+    </w:p>
+    <w:p>
+      <w:pPr>
+        <w:pStyle w:val="Text"/>
+        <w:numPr>
+          <w:ilvl w:val="0"/>
+          <w:numId w:val="28"/>
+        </w:numPr>
+        <w:jc w:val="both"/>
+        <w:rPr>
+          <w:rFonts w:ascii="Arial Narrow" w:hAnsi="Arial Narrow" w:cs="Arial"/>
+          <w:sz w:val="16"/>
+          <w:szCs w:val="16"/>
+        </w:rPr>
+      </w:pPr>
+      <w:r>
+        <w:rPr>
+          <w:rFonts w:ascii="Arial Narrow" w:hAnsi="Arial Narrow" w:cs="Arial"/>
+          <w:sz w:val="16"/>
+          <w:szCs w:val="16"/>
+        </w:rPr>
+        <w:t>Smluvní pokuta je splatná do 14 dnů ode dne doručení písemné výzvy pronajímatele k jejímu uhrazení,</w:t>
+      </w:r>
+      <w:r>
+        <w:rPr>
+          <w:rFonts w:ascii="Arial Narrow" w:hAnsi="Arial Narrow" w:cs="Arial"/>
+          <w:sz w:val="16"/>
+          <w:szCs w:val="16"/>
+        </w:rPr>
+        <w:t xml:space="preserve"> </w:t>
+      </w:r>
+      <w:r>
+        <w:rPr>
+          <w:rFonts w:ascii="Arial Narrow" w:hAnsi="Arial Narrow" w:cs="Arial"/>
+          <w:sz w:val="16"/>
+          <w:szCs w:val="16"/>
+        </w:rPr>
+        <w:t>a to na určený bankovní účet pronajímatele.</w:t>
+      </w:r>
+    </w:p>
+    <w:p>
+      <w:pPr>
+        <w:pStyle w:val="Text"/>
+        <w:numPr>
+          <w:ilvl w:val="0"/>
+          <w:numId w:val="28"/>
+        </w:numPr>
+        <w:jc w:val="both"/>
+        <w:rPr>
+          <w:rFonts w:ascii="Arial Narrow" w:hAnsi="Arial Narrow" w:cs="Arial"/>
+          <w:sz w:val="16"/>
+          <w:szCs w:val="16"/>
+        </w:rPr>
+      </w:pPr>
+      <w:r>
+        <w:rPr>
+          <w:rFonts w:ascii="Arial Narrow" w:hAnsi="Arial Narrow" w:cs="Arial"/>
+          <w:sz w:val="16"/>
+          <w:szCs w:val="16"/>
+        </w:rPr>
+        <w:t>Nezávisle na povinnosti uhradit smluvní pokutu či úrok z prodlení musí povinná strana nahradit druhé smluvní straně též škodu, vzniklou druhé smluvní straně v důsledku porušení povinností stranou povinnou. Pronajímatel má právo na náhradu škody vzniklé nesplněním peněžitého dluhu i tehdy, je-li tato kryta úroky z prodlení, čímž smluvní strany výslovně vylučují úpravu dle § 1971 občanského zákoníku.</w:t>
+      </w:r>
+    </w:p>
+    <w:p>
+      <w:pPr>
+        <w:pStyle w:val="Text"/>
+        <w:numPr>
+          <w:ilvl w:val="0"/>
+          <w:numId w:val="28"/>
+        </w:numPr>
+        <w:jc w:val="both"/>
+        <w:rPr>
+          <w:rFonts w:ascii="Arial Narrow" w:hAnsi="Arial Narrow" w:cs="Arial"/>
+          <w:sz w:val="16"/>
+          <w:szCs w:val="16"/>
+        </w:rPr>
+      </w:pPr>
+      <w:r>
+        <w:rPr>
+          <w:rFonts w:ascii="Arial Narrow" w:hAnsi="Arial Narrow" w:cs="Arial"/>
+          <w:sz w:val="16"/>
+          <w:szCs w:val="16"/>
+        </w:rPr>
+        <w:t>Žádným ustanovením tohoto článku Smlouvy není dotčeno právo dotčené smluvní strany z téhož důvodu Smlouvu vypovědět nebo přijmout jiná opatření, touto Smlouvou předvídaná.</w:t>
+      </w:r>
+    </w:p>
+    <w:p>
+      <w:pPr>
+        <w:pStyle w:val="Text"/>
+        <w:numPr>
+          <w:ilvl w:val="0"/>
+          <w:numId w:val="28"/>
+        </w:numPr>
+        <w:jc w:val="both"/>
+        <w:rPr>
+          <w:rFonts w:ascii="Arial Narrow" w:hAnsi="Arial Narrow" w:cs="Arial"/>
+          <w:sz w:val="16"/>
+          <w:szCs w:val="16"/>
+        </w:rPr>
+      </w:pPr>
+      <w:r>
+        <w:rPr>
+          <w:rFonts w:ascii="Arial Narrow" w:hAnsi="Arial Narrow" w:cs="Arial"/>
+          <w:sz w:val="16"/>
+          <w:szCs w:val="16"/>
+        </w:rPr>
+        <w:t>Žádné z ustanovení tohoto článku Smlouvy není zánikem Smlouvy dotčeno.</w:t>
+      </w:r>
+    </w:p>
+    <w:p>
+      <w:pPr>
+        <w:pStyle w:val="Text"/>
+        <w:rPr>
+          <w:rFonts w:ascii="Arial Narrow" w:eastAsia="Helvetica Neue Thin" w:hAnsi="Arial Narrow" w:cs="Arial"/>
+          <w:sz w:val="16"/>
+          <w:szCs w:val="16"/>
+        </w:rPr>
+      </w:pPr>
+    </w:p>
+    <w:p>
+      <w:pPr>
+        <w:pStyle w:val="Nadpis"/>
+        <w:numPr>
+          <w:ilvl w:val="0"/>
+          <w:numId w:val="16"/>
+        </w:numPr>
+        <w:rPr>
+          <w:rFonts w:ascii="Arial Narrow" w:hAnsi="Arial Narrow" w:cs="Arial"/>
+          <w:u w:val="single"/>
+        </w:rPr>
+      </w:pPr>
+      <w:bookmarkStart w:id="8" w:name="_Toc8"/>
+      <w:r>
+        <w:rPr>
+          <w:rFonts w:ascii="Arial Narrow" w:eastAsia="Arial Unicode MS" w:hAnsi="Arial Narrow" w:cs="Arial"/>
+          <w:u w:val="single"/>
+        </w:rPr>
+        <w:t>Zajištění</w:t>
+      </w:r>
+      <w:bookmarkEnd w:id="8"/>
+    </w:p>
+    <w:p>
+      <w:pPr>
+        <w:pStyle w:val="Text"/>
+        <w:rPr>
+          <w:rFonts w:ascii="Arial Narrow" w:eastAsia="Helvetica Neue Thin" w:hAnsi="Arial Narrow" w:cs="Arial"/>
+          <w:sz w:val="16"/>
+          <w:szCs w:val="16"/>
+        </w:rPr>
+      </w:pPr>
+    </w:p>
+    <w:p>
+      <w:pPr>
+        <w:pStyle w:val="Text"/>
+        <w:numPr>
+          <w:ilvl w:val="0"/>
+          <w:numId w:val="29"/>
+        </w:numPr>
+        <w:jc w:val="both"/>
+        <w:rPr>
+          <w:rFonts w:ascii="Arial Narrow" w:hAnsi="Arial Narrow" w:cs="Arial"/>
+          <w:sz w:val="16"/>
+          <w:szCs w:val="16"/>
+        </w:rPr>
+      </w:pPr>
+      <w:r>
+        <w:rPr>
+          <w:rFonts w:ascii="Arial Narrow" w:hAnsi="Arial Narrow" w:cs="Arial"/>
+          <w:sz w:val="16"/>
+        </w:rPr>
+        <w:t xml:space="preserve">Nájemce je povinen při podpisu smlouvy zaplatit pronajímateli kauci ve výši </w:t>
       </w:r>
       <w:r>
         <w:rPr>
           <w:rFonts w:ascii="Arial Narrow" w:hAnsi="Arial Narrow" w:cs="Arial"/>
           <w:sz w:val="16"/>
           <w:highlight w:val="yellow"/>
-          <w:u w:val="single"/>
-        </w:rPr>
-        <w:t>3 měsíce</w:t>
-      </w:r>
-      <w:r>
-        <w:rPr>
-          <w:rFonts w:ascii="Arial Narrow" w:hAnsi="Arial Narrow" w:cs="Arial"/>
-          <w:sz w:val="16"/>
-        </w:rPr>
-        <w:t xml:space="preserve"> a její běh začíná prvním dnem kalendářního měsíce bezprostředně následujícího po doručení výpovědi druhé smluvní straně. </w:t>
-      </w:r>
-    </w:p>
-    <w:p>
-      <w:pPr>
-        <w:pStyle w:val="Text"/>
-        <w:numPr>
-          <w:ilvl w:val="0"/>
-          <w:numId w:val="20"/>
-        </w:numPr>
-        <w:jc w:val="both"/>
-        <w:rPr>
-          <w:rFonts w:ascii="Arial Narrow" w:hAnsi="Arial Narrow" w:cs="Arial"/>
-          <w:sz w:val="16"/>
-          <w:szCs w:val="16"/>
-        </w:rPr>
-      </w:pPr>
-      <w:r>
-        <w:rPr>
-          <w:rFonts w:ascii="Arial Narrow" w:hAnsi="Arial Narrow" w:cs="Arial"/>
-          <w:sz w:val="16"/>
-          <w:szCs w:val="16"/>
-        </w:rPr>
-        <w:t>Pronajímatel však může tuto smlouvu vypovědět s výpovědní dobou v trvání 30 dnů ode dne doručení výpovědi nájemci z důvodů, že nájemce porušuje kterékoli z ustanovení odst. 5.2, 5.3, 5.4, 5.9, 5.13, 5.15, 5.17, 6.1 nebo 6.2 nebo že se nájemce dostal do prodlení delšího než 30 dnů s jakýmkoli peněžitým plněním podle Smlouvy nebo že nájemce nebo třetí osoby užívají Předmět nájmu způsobem odporujícím veřejnému pořádku nebo že bylo zahájeno proti nájemci jako dlužníkovi insolvenční řízení podle zákona č. 182/2006 Sb., insolvenčního zákona, ve znění pozdějších předpisů. V případě výpovědi dle tohoto písmene se ustanovení písmene (B) nepoužije.</w:t>
-      </w:r>
-    </w:p>
-    <w:p>
-      <w:pPr>
-        <w:pStyle w:val="Text"/>
-        <w:numPr>
-          <w:ilvl w:val="0"/>
-          <w:numId w:val="25"/>
-        </w:numPr>
-        <w:jc w:val="both"/>
-        <w:rPr>
-          <w:rFonts w:ascii="Arial Narrow" w:hAnsi="Arial Narrow" w:cs="Arial"/>
-          <w:sz w:val="16"/>
-        </w:rPr>
-      </w:pPr>
-      <w:r>
-        <w:rPr>
-          <w:rFonts w:ascii="Arial Narrow" w:hAnsi="Arial Narrow" w:cs="Arial"/>
-          <w:sz w:val="16"/>
-        </w:rPr>
-        <w:t xml:space="preserve">Nájemce se tímto vzdává svého práva vznést proti výpovědi námitky ve smyslu § 2314 občanského zákoníku. </w:t>
-      </w:r>
-    </w:p>
-    <w:p>
-      <w:pPr>
-        <w:pStyle w:val="Text"/>
-        <w:numPr>
-          <w:ilvl w:val="0"/>
-          <w:numId w:val="25"/>
-        </w:numPr>
-        <w:jc w:val="both"/>
-        <w:rPr>
-          <w:rFonts w:ascii="Arial Narrow" w:hAnsi="Arial Narrow" w:cs="Arial"/>
-          <w:sz w:val="16"/>
-        </w:rPr>
-      </w:pPr>
-      <w:r>
-        <w:rPr>
-          <w:rFonts w:ascii="Arial Narrow" w:hAnsi="Arial Narrow" w:cs="Arial"/>
-          <w:sz w:val="16"/>
-        </w:rPr>
-        <w:t>Ke dni ukončení nájemního vztahu z této Smlouvy se nájemce zavazuje vypořádat veškeré závazky vyplývající ze Smlouvy a to především:</w:t>
-      </w:r>
-    </w:p>
-    <w:p>
-      <w:pPr>
-        <w:pStyle w:val="Text"/>
-        <w:numPr>
-          <w:ilvl w:val="0"/>
-          <w:numId w:val="27"/>
-        </w:numPr>
-        <w:jc w:val="both"/>
-        <w:rPr>
-          <w:rFonts w:ascii="Arial Narrow" w:hAnsi="Arial Narrow" w:cs="Arial"/>
-          <w:sz w:val="16"/>
-          <w:szCs w:val="16"/>
-        </w:rPr>
-      </w:pPr>
-      <w:r>
-        <w:rPr>
-          <w:rFonts w:ascii="Arial Narrow" w:hAnsi="Arial Narrow" w:cs="Arial"/>
-          <w:sz w:val="16"/>
-          <w:szCs w:val="16"/>
-        </w:rPr>
-        <w:t>vrátit pronajímateli Předmět nájmu včetně příslušenství v takovém stavu, v jakém mu byl předán</w:t>
-      </w:r>
-      <w:r>
+        </w:rPr>
+        <w:t>15 000 Kč</w:t>
+      </w:r>
+      <w:r>
+        <w:rPr>
+          <w:rFonts w:ascii="Arial Narrow" w:hAnsi="Arial Narrow" w:cs="Arial"/>
+          <w:sz w:val="16"/>
+        </w:rPr>
+        <w:t>. Kauce je určena k zajištění pohledávek, jež by mohly pronajímateli vzniknout vůči nájemci za trvání této Smlouvy, zejména pohledávek z titulu nájemného, cen poskytovaných služeb, náhrady škody, smluvních pokut a úroků z prodlení. Pronajímatel je oprávněn čerpat kauci k uspokojení těchto svých nároků, pokud se nájemce dostane do prodlení s jejich placením; o čerpání kauce pronajímatel nájemce písemně informuje. Nájemce je povinen bez zbytečného odkladu, nejpozději však do 3 dnů od doručení oznámení pronajímatele o čerpání kauce a jeho rozsahu, doplnit kauci do původní výše. Složená kauce bude nájemci vrácena do 15 dnů od skončení nájemního vztahu podle Smlouvy. Pokud však dojde ke sporu ohledně nároků vyplývajících z této Smlouvy, je pronajímatel povinen vrátit kauci do 15 dnů od účinnosti dohody o vypořádání těchto sporných nároků nebo od právní moci rozhodnutí soudu ve věci. Pronajímatel je oprávněn před vrácením kauce započíst oproti kauci veškeré své pohledávky za nájemcem. Pronajímatel není v žádném případě povinen vrátit nájemci poskytnutou kauci nebo její část, zbývající po započtení pohledávek pronajímatele, dokud nájemce nesplní svou povinnost vrátit pronajímateli Předmět nájmu včetně příslušenství v takovém stavu, v jakém mu byl předán (s ohledem k běžnému opotřebení). Kauce se neúročí ani jiným způsobem nezhodnocuje.</w:t>
+      </w:r>
+    </w:p>
+    <w:p>
+      <w:pPr>
+        <w:pStyle w:val="Text"/>
         <w:rPr>
           <w:rFonts w:ascii="Arial Narrow" w:eastAsia="Helvetica Neue Thin" w:hAnsi="Arial Narrow" w:cs="Arial"/>
           <w:sz w:val="16"/>
           <w:szCs w:val="16"/>
         </w:rPr>
-        <w:t xml:space="preserve"> </w:t>
-      </w:r>
-      <w:r>
-        <w:rPr>
-          <w:rFonts w:ascii="Arial Narrow" w:hAnsi="Arial Narrow" w:cs="Arial"/>
-          <w:sz w:val="16"/>
-          <w:szCs w:val="16"/>
-        </w:rPr>
-        <w:t>(s ohledem k běžnému opotřebení); o tom bude sepsán předávací protokol,</w:t>
-      </w:r>
-    </w:p>
-    <w:p>
-      <w:pPr>
-        <w:pStyle w:val="Text"/>
-        <w:numPr>
-          <w:ilvl w:val="0"/>
-          <w:numId w:val="20"/>
-        </w:numPr>
-        <w:jc w:val="both"/>
-        <w:rPr>
-          <w:rFonts w:ascii="Arial Narrow" w:hAnsi="Arial Narrow" w:cs="Arial"/>
-          <w:sz w:val="16"/>
-          <w:szCs w:val="16"/>
-        </w:rPr>
-      </w:pPr>
-      <w:r>
-        <w:rPr>
-          <w:rFonts w:ascii="Arial Narrow" w:hAnsi="Arial Narrow" w:cs="Arial"/>
-          <w:sz w:val="16"/>
-          <w:szCs w:val="16"/>
-        </w:rPr>
-        <w:t>vyrovnat finanční závazky vyplývající ze Smlouvy,</w:t>
-      </w:r>
-    </w:p>
-    <w:p>
-      <w:pPr>
-        <w:pStyle w:val="Text"/>
-        <w:numPr>
-          <w:ilvl w:val="0"/>
-          <w:numId w:val="20"/>
-        </w:numPr>
-        <w:jc w:val="both"/>
-        <w:rPr>
-          <w:rFonts w:ascii="Arial Narrow" w:hAnsi="Arial Narrow" w:cs="Arial"/>
-          <w:sz w:val="16"/>
-          <w:szCs w:val="16"/>
-        </w:rPr>
-      </w:pPr>
-      <w:r>
-        <w:rPr>
-          <w:rFonts w:ascii="Arial Narrow" w:hAnsi="Arial Narrow" w:cs="Arial"/>
-          <w:sz w:val="16"/>
-          <w:szCs w:val="16"/>
-        </w:rPr>
-        <w:t>vymalovat pronajaté prostory,</w:t>
-      </w:r>
-    </w:p>
-    <w:p>
-      <w:pPr>
-        <w:pStyle w:val="Text"/>
-        <w:numPr>
-          <w:ilvl w:val="0"/>
-          <w:numId w:val="20"/>
-        </w:numPr>
-        <w:jc w:val="both"/>
-        <w:rPr>
-          <w:rFonts w:ascii="Arial Narrow" w:hAnsi="Arial Narrow" w:cs="Arial"/>
-          <w:sz w:val="16"/>
-          <w:szCs w:val="16"/>
-        </w:rPr>
-      </w:pPr>
-      <w:r>
-        <w:rPr>
-          <w:rFonts w:ascii="Arial Narrow" w:hAnsi="Arial Narrow" w:cs="Arial"/>
-          <w:sz w:val="16"/>
-          <w:szCs w:val="16"/>
-        </w:rPr>
-        <w:t>opravit a v případě většího poškození vyměnit podlahovou krytinu.</w:t>
-      </w:r>
-    </w:p>
-    <w:p>
-      <w:pPr>
-        <w:pStyle w:val="Text"/>
-        <w:numPr>
-          <w:ilvl w:val="0"/>
-          <w:numId w:val="25"/>
-        </w:numPr>
-        <w:jc w:val="both"/>
-        <w:rPr>
-          <w:rFonts w:ascii="Arial Narrow" w:hAnsi="Arial Narrow" w:cs="Arial"/>
-          <w:sz w:val="16"/>
-        </w:rPr>
-      </w:pPr>
-      <w:r>
-        <w:rPr>
-          <w:rFonts w:ascii="Arial Narrow" w:hAnsi="Arial Narrow" w:cs="Arial"/>
-          <w:sz w:val="16"/>
-        </w:rPr>
-        <w:t>Smluvní strany ujednávají, že v případě, že z jakéhokoli důvodu skončí nájemní vztah dle této Smlouvy a nájemce ani po jeho skončení přes písemnou výzvu pronajímatele, aby Nemovitosti vyklidil ve lhůtě alespoň 3 kalendářních dnů od doručení výzvy, Nemovitosti nevyklidí a pronajímateli vyklizené nepředá, je pronajímatel oprávněn znepřístupnit nájemci Předmět nájmu a dále sám nebo pomocí třetí osoby na náklady nájemce a na jeho nebezpečí vyklidit Nemovitosti. V takovém případě je pronajímatel oprávněn veškeré věci, které v Nemovitostech nájemce zanechal, uskladnit na náklady nájemce a na jeho nebezpečí u kterékoli třetí osoby nebo ve vlastních prostorách. Nájemce k tomuto postupu uděluje pronajímateli výslovný, jednostranně neodvolatelný souhlas. Současně nájemce zmocňuje pronajímatele, aby v případě, že pronajímatel využije svého oprávnění dle věty druhé a nájemce po dobu tří měsíců od uskladnění vyklizených věcí nevyzve pronajímatele k vydání uvedených věcí či tyto nepřevezme, prodal pronajímatel jménem nájemce a na jeho účet veškeré takto uskladněné věci kterékoli třetí osobě. Výtěžek prodeje uvedených věcí je pronajímatel oprávněn v plném rozsahu započíst vůči jakékoli své pohledávce za nájemcem, včetně pohledávky z titulu ceny znepřístupnění Předmětu nájmu a ceny uskladnění těchto věcí.</w:t>
-      </w:r>
-    </w:p>
-    <w:p>
-      <w:pPr>
-        <w:pStyle w:val="Text"/>
-        <w:numPr>
-          <w:ilvl w:val="0"/>
-          <w:numId w:val="25"/>
-        </w:numPr>
-        <w:jc w:val="both"/>
-        <w:rPr>
-          <w:rFonts w:ascii="Arial Narrow" w:hAnsi="Arial Narrow" w:cs="Arial"/>
-          <w:sz w:val="16"/>
-        </w:rPr>
-      </w:pPr>
-      <w:r>
-        <w:rPr>
-          <w:rFonts w:ascii="Arial Narrow" w:hAnsi="Arial Narrow" w:cs="Arial"/>
-          <w:sz w:val="16"/>
-        </w:rPr>
-        <w:t>Smluvní strany se dohodly, že nájemce nemá, zejména s ohledem na povahu podnikatelské činnosti nájemce, resp. povahu Předmětu nájmu, právo na náhradu za převzetí zákaznické základny ve smyslu § 2315 občanského zákoníku.</w:t>
-      </w:r>
-    </w:p>
-    <w:p>
-      <w:pPr>
-        <w:pStyle w:val="Text"/>
-        <w:numPr>
-          <w:ilvl w:val="0"/>
-          <w:numId w:val="25"/>
-        </w:numPr>
-        <w:jc w:val="both"/>
-        <w:rPr>
-          <w:rFonts w:ascii="Arial Narrow" w:hAnsi="Arial Narrow" w:cs="Arial"/>
-          <w:sz w:val="16"/>
-        </w:rPr>
-      </w:pPr>
-      <w:r>
-        <w:rPr>
-          <w:rFonts w:ascii="Arial Narrow" w:hAnsi="Arial Narrow" w:cs="Arial"/>
-          <w:sz w:val="16"/>
-        </w:rPr>
-        <w:t>Smluvní strany dále vylučují aplikaci ustanovení § 2230 občanského zákoníku.</w:t>
-      </w:r>
-    </w:p>
-    <w:p>
-      <w:pPr>
-        <w:pStyle w:val="Text"/>
-        <w:numPr>
-          <w:ilvl w:val="0"/>
-          <w:numId w:val="25"/>
-        </w:numPr>
-        <w:jc w:val="both"/>
-        <w:rPr>
-          <w:rFonts w:ascii="Arial Narrow" w:hAnsi="Arial Narrow" w:cs="Arial"/>
-          <w:sz w:val="16"/>
-        </w:rPr>
-      </w:pPr>
-      <w:r>
-        <w:rPr>
-          <w:rFonts w:ascii="Arial Narrow" w:hAnsi="Arial Narrow" w:cs="Arial"/>
-          <w:sz w:val="16"/>
-        </w:rPr>
-        <w:t xml:space="preserve">Nájemce není oprávněn požadovat zrušení Smlouvy pro změnu okolností a ve smyslu § 2000 odst. 2 občanského zákoníku se tímto vzdává svého práva </w:t>
-      </w:r>
-      <w:proofErr w:type="gramStart"/>
-      <w:r>
-        <w:rPr>
-          <w:rFonts w:ascii="Arial Narrow" w:hAnsi="Arial Narrow" w:cs="Arial"/>
-          <w:sz w:val="16"/>
-        </w:rPr>
-        <w:t>se</w:t>
-      </w:r>
-      <w:proofErr w:type="gramEnd"/>
-      <w:r>
-        <w:rPr>
-          <w:rFonts w:ascii="Arial Narrow" w:hAnsi="Arial Narrow" w:cs="Arial"/>
-          <w:sz w:val="16"/>
-        </w:rPr>
-        <w:t xml:space="preserve"> zrušení Smlouvy domáhat.</w:t>
-      </w:r>
-    </w:p>
-    <w:p>
-      <w:pPr>
-        <w:pStyle w:val="Text"/>
-        <w:rPr>
-          <w:rFonts w:ascii="Arial Narrow" w:eastAsia="Helvetica Neue Thin" w:hAnsi="Arial Narrow" w:cs="Arial"/>
-          <w:sz w:val="16"/>
-          <w:szCs w:val="16"/>
-        </w:rPr>
       </w:pPr>
     </w:p>
     <w:p>
@@ -4508,307 +4780,6 @@
         </w:numPr>
         <w:rPr>
           <w:rFonts w:ascii="Arial Narrow" w:hAnsi="Arial Narrow" w:cs="Arial"/>
-          <w:b w:val="0"/>
-          <w:bCs w:val="0"/>
-          <w:u w:val="single"/>
-        </w:rPr>
-      </w:pPr>
-      <w:bookmarkStart w:id="7" w:name="_Toc7"/>
-      <w:r>
-        <w:rPr>
-          <w:rFonts w:ascii="Arial Narrow" w:eastAsia="Arial Unicode MS" w:hAnsi="Arial Narrow" w:cs="Arial"/>
-          <w:b w:val="0"/>
-          <w:bCs w:val="0"/>
-          <w:u w:val="single"/>
-        </w:rPr>
-        <w:t>Sankce a náhrada škody</w:t>
-      </w:r>
-      <w:bookmarkEnd w:id="7"/>
-    </w:p>
-    <w:p>
-      <w:pPr>
-        <w:pStyle w:val="Text"/>
-        <w:rPr>
-          <w:rFonts w:ascii="Arial Narrow" w:hAnsi="Arial Narrow" w:cs="Arial"/>
-          <w:sz w:val="16"/>
-          <w:szCs w:val="16"/>
-        </w:rPr>
-      </w:pPr>
-    </w:p>
-    <w:p>
-      <w:pPr>
-        <w:pStyle w:val="Text"/>
-        <w:numPr>
-          <w:ilvl w:val="0"/>
-          <w:numId w:val="28"/>
-        </w:numPr>
-        <w:jc w:val="both"/>
-        <w:rPr>
-          <w:rFonts w:ascii="Arial Narrow" w:hAnsi="Arial Narrow" w:cs="Arial"/>
-          <w:sz w:val="16"/>
-          <w:szCs w:val="16"/>
-        </w:rPr>
-      </w:pPr>
-      <w:r>
-        <w:rPr>
-          <w:rFonts w:ascii="Arial Narrow" w:hAnsi="Arial Narrow" w:cs="Arial"/>
-          <w:sz w:val="16"/>
-          <w:szCs w:val="16"/>
-        </w:rPr>
-        <w:t xml:space="preserve">Nájemce je povinen zaplatit pronajímateli smluvní pokutu ve výši 100 Kč denně za každé jednotlivé porušení kterékoli z povinností stanovených odst. 5.2, 5.3, 5.4, 5.9, 5.10, 5.13, 5.14, 5.15, 5.17, 6.1 nebo 6.2 Smlouvy, a to až do sjednání nápravy. </w:t>
-      </w:r>
-    </w:p>
-    <w:p>
-      <w:pPr>
-        <w:pStyle w:val="Text"/>
-        <w:numPr>
-          <w:ilvl w:val="0"/>
-          <w:numId w:val="28"/>
-        </w:numPr>
-        <w:jc w:val="both"/>
-        <w:rPr>
-          <w:rFonts w:ascii="Arial Narrow" w:hAnsi="Arial Narrow" w:cs="Arial"/>
-          <w:sz w:val="16"/>
-          <w:szCs w:val="16"/>
-        </w:rPr>
-      </w:pPr>
-      <w:r>
-        <w:rPr>
-          <w:rFonts w:ascii="Arial Narrow" w:hAnsi="Arial Narrow" w:cs="Arial"/>
-          <w:sz w:val="16"/>
-          <w:szCs w:val="16"/>
-        </w:rPr>
-        <w:t xml:space="preserve">Nájemce je povinen zaplatit pronajímateli smluvní pokutu ve výši </w:t>
-      </w:r>
-      <w:r>
-        <w:rPr>
-          <w:rFonts w:ascii="Arial Narrow" w:hAnsi="Arial Narrow" w:cs="Arial"/>
-          <w:sz w:val="16"/>
-          <w:szCs w:val="16"/>
-        </w:rPr>
-        <w:t>0,1 %</w:t>
-      </w:r>
-      <w:r>
-        <w:rPr>
-          <w:rFonts w:ascii="Arial Narrow" w:hAnsi="Arial Narrow" w:cs="Arial"/>
-          <w:sz w:val="16"/>
-          <w:szCs w:val="16"/>
-        </w:rPr>
-        <w:t xml:space="preserve"> z výše dlužné částky za každý den prodlení s placením jakéhokoli peněžitého dluhu dle této Smlouvy.</w:t>
-      </w:r>
-    </w:p>
-    <w:p>
-      <w:pPr>
-        <w:pStyle w:val="Text"/>
-        <w:numPr>
-          <w:ilvl w:val="0"/>
-          <w:numId w:val="28"/>
-        </w:numPr>
-        <w:jc w:val="both"/>
-        <w:rPr>
-          <w:rFonts w:ascii="Arial Narrow" w:hAnsi="Arial Narrow" w:cs="Arial"/>
-          <w:sz w:val="16"/>
-          <w:szCs w:val="16"/>
-        </w:rPr>
-      </w:pPr>
-      <w:r>
-        <w:rPr>
-          <w:rFonts w:ascii="Arial Narrow" w:hAnsi="Arial Narrow" w:cs="Arial"/>
-          <w:sz w:val="16"/>
-          <w:szCs w:val="16"/>
-        </w:rPr>
-        <w:t>Smluvní pokuta je splatná do 14 dnů ode dne doručení písemné výzvy pronajímatele k jejímu uhrazení,</w:t>
-      </w:r>
-      <w:r>
-        <w:rPr>
-          <w:rFonts w:ascii="Arial Narrow" w:hAnsi="Arial Narrow" w:cs="Arial"/>
-          <w:sz w:val="16"/>
-          <w:szCs w:val="16"/>
-        </w:rPr>
-        <w:t xml:space="preserve"> </w:t>
-      </w:r>
-      <w:r>
-        <w:rPr>
-          <w:rFonts w:ascii="Arial Narrow" w:hAnsi="Arial Narrow" w:cs="Arial"/>
-          <w:sz w:val="16"/>
-          <w:szCs w:val="16"/>
-        </w:rPr>
-        <w:t>a to na určený bankovní účet pronajímatele.</w:t>
-      </w:r>
-    </w:p>
-    <w:p>
-      <w:pPr>
-        <w:pStyle w:val="Text"/>
-        <w:numPr>
-          <w:ilvl w:val="0"/>
-          <w:numId w:val="28"/>
-        </w:numPr>
-        <w:jc w:val="both"/>
-        <w:rPr>
-          <w:rFonts w:ascii="Arial Narrow" w:hAnsi="Arial Narrow" w:cs="Arial"/>
-          <w:sz w:val="16"/>
-          <w:szCs w:val="16"/>
-        </w:rPr>
-      </w:pPr>
-      <w:r>
-        <w:rPr>
-          <w:rFonts w:ascii="Arial Narrow" w:hAnsi="Arial Narrow" w:cs="Arial"/>
-          <w:sz w:val="16"/>
-          <w:szCs w:val="16"/>
-        </w:rPr>
-        <w:t>Nezávisle na povinnosti uhradit smluvní pokutu či úrok z prodlení musí povinná strana nahradit druhé smluvní straně též škodu, vzniklou druhé smluvní straně v důsledku porušení povinností stranou povinnou. Pronajímatel má právo na náhradu škody vzniklé nesplněním peněžitého dluhu i tehdy, je-li tato kryta úroky z prodlení, čímž smluvní strany výslovně vylučují úpravu dle § 1971 občanského zákoníku.</w:t>
-      </w:r>
-    </w:p>
-    <w:p>
-      <w:pPr>
-        <w:pStyle w:val="Text"/>
-        <w:numPr>
-          <w:ilvl w:val="0"/>
-          <w:numId w:val="28"/>
-        </w:numPr>
-        <w:jc w:val="both"/>
-        <w:rPr>
-          <w:rFonts w:ascii="Arial Narrow" w:hAnsi="Arial Narrow" w:cs="Arial"/>
-          <w:sz w:val="16"/>
-          <w:szCs w:val="16"/>
-        </w:rPr>
-      </w:pPr>
-      <w:r>
-        <w:rPr>
-          <w:rFonts w:ascii="Arial Narrow" w:hAnsi="Arial Narrow" w:cs="Arial"/>
-          <w:sz w:val="16"/>
-          <w:szCs w:val="16"/>
-        </w:rPr>
-        <w:t>Žádným ustanovením tohoto článku Smlouvy není dotčeno právo dotčené smluvní strany z téhož důvodu Smlouvu vypovědět nebo přijmout jiná opatření, touto Smlouvou předvídaná.</w:t>
-      </w:r>
-    </w:p>
-    <w:p>
-      <w:pPr>
-        <w:pStyle w:val="Text"/>
-        <w:numPr>
-          <w:ilvl w:val="0"/>
-          <w:numId w:val="28"/>
-        </w:numPr>
-        <w:jc w:val="both"/>
-        <w:rPr>
-          <w:rFonts w:ascii="Arial Narrow" w:hAnsi="Arial Narrow" w:cs="Arial"/>
-          <w:sz w:val="16"/>
-          <w:szCs w:val="16"/>
-        </w:rPr>
-      </w:pPr>
-      <w:r>
-        <w:rPr>
-          <w:rFonts w:ascii="Arial Narrow" w:hAnsi="Arial Narrow" w:cs="Arial"/>
-          <w:sz w:val="16"/>
-          <w:szCs w:val="16"/>
-        </w:rPr>
-        <w:t>Žádné z ustanovení tohoto článku Smlouvy není zánikem Smlouvy dotčeno.</w:t>
-      </w:r>
-    </w:p>
-    <w:p>
-      <w:pPr>
-        <w:pStyle w:val="Text"/>
-        <w:rPr>
-          <w:rFonts w:ascii="Arial Narrow" w:eastAsia="Helvetica Neue Thin" w:hAnsi="Arial Narrow" w:cs="Arial"/>
-          <w:sz w:val="16"/>
-          <w:szCs w:val="16"/>
-        </w:rPr>
-      </w:pPr>
-    </w:p>
-    <w:p>
-      <w:pPr>
-        <w:pStyle w:val="Nadpis"/>
-        <w:numPr>
-          <w:ilvl w:val="0"/>
-          <w:numId w:val="16"/>
-        </w:numPr>
-        <w:rPr>
-          <w:rFonts w:ascii="Arial Narrow" w:hAnsi="Arial Narrow" w:cs="Arial"/>
-          <w:b w:val="0"/>
-          <w:bCs w:val="0"/>
-          <w:u w:val="single"/>
-        </w:rPr>
-      </w:pPr>
-      <w:bookmarkStart w:id="8" w:name="_Toc8"/>
-      <w:r>
-        <w:rPr>
-          <w:rFonts w:ascii="Arial Narrow" w:eastAsia="Arial Unicode MS" w:hAnsi="Arial Narrow" w:cs="Arial"/>
-          <w:b w:val="0"/>
-          <w:bCs w:val="0"/>
-          <w:u w:val="single"/>
-        </w:rPr>
-        <w:t>Zajištění</w:t>
-      </w:r>
-      <w:bookmarkEnd w:id="8"/>
-    </w:p>
-    <w:p>
-      <w:pPr>
-        <w:pStyle w:val="Text"/>
-        <w:rPr>
-          <w:rFonts w:ascii="Arial Narrow" w:eastAsia="Helvetica Neue Thin" w:hAnsi="Arial Narrow" w:cs="Arial"/>
-          <w:sz w:val="16"/>
-          <w:szCs w:val="16"/>
-        </w:rPr>
-      </w:pPr>
-    </w:p>
-    <w:p>
-      <w:pPr>
-        <w:pStyle w:val="Text"/>
-        <w:numPr>
-          <w:ilvl w:val="0"/>
-          <w:numId w:val="29"/>
-        </w:numPr>
-        <w:jc w:val="both"/>
-        <w:rPr>
-          <w:rFonts w:ascii="Arial Narrow" w:hAnsi="Arial Narrow" w:cs="Arial"/>
-          <w:sz w:val="16"/>
-          <w:szCs w:val="16"/>
-        </w:rPr>
-      </w:pPr>
-      <w:r>
-        <w:rPr>
-          <w:rFonts w:ascii="Arial Narrow" w:hAnsi="Arial Narrow" w:cs="Arial"/>
-          <w:sz w:val="16"/>
-        </w:rPr>
-        <w:t xml:space="preserve">Nájemce je povinen při podpisu smlouvy zaplatit pronajímateli kauci ve výši </w:t>
-      </w:r>
-      <w:r>
-        <w:rPr>
-          <w:rFonts w:ascii="Arial Narrow" w:hAnsi="Arial Narrow" w:cs="Arial"/>
-          <w:sz w:val="16"/>
-          <w:highlight w:val="yellow"/>
-        </w:rPr>
-        <w:t>15 000 Kč</w:t>
-      </w:r>
-      <w:r>
-        <w:rPr>
-          <w:rFonts w:ascii="Arial Narrow" w:hAnsi="Arial Narrow" w:cs="Arial"/>
-          <w:sz w:val="16"/>
-        </w:rPr>
-        <w:t>. Kauce je určena k zajištění pohledávek, jež by mohly pronajímateli vzniknout vůči nájemci za trvání této Smlouvy, zejména pohledávek z titulu nájemného, cen poskytovaných služeb, náhrady škody, smluvních pokut a úroků z prodlení. Pronajímatel je oprávněn čerpat kauci k uspokojení těchto svých nároků, pokud se nájemce dostane do prodlení s jejich placením; o čerpání kauce pronajímatel nájemce písemně informuje. Nájemce je povinen bez zbytečného odkladu, nejpozději však do 3 dnů od doručení oznámení pronajímatele o čerpání kauce a jeho rozsahu, doplnit kauci do původní výše. Složená kauce bude nájemci vrácena do 15 dnů od skončení nájemního vztahu podle Smlouvy. Pokud však dojde ke sporu ohledně nároků vyplývajících z této Smlouvy, je pronajímatel povinen vrátit kauci do 15 dnů od účinnosti dohody o vypořádání těchto sporných nároků nebo od právní moci rozhodnutí soudu ve věci. Pronajímatel je oprávněn před vrácením kauce započíst oproti kauci veškeré své pohledávky za nájemcem. Pronajímatel není v žádném případě povinen vrátit nájemci poskytnutou kauci nebo její část, zbývající po započtení pohledávek pronajímatele, dokud nájemce nesplní svou povinnost vrátit pronajímateli Předmět nájmu včetně příslušenství v takovém stavu, v jakém mu byl předán (s ohledem k běžnému opotřebení). Kauce se neúročí ani jiným způsobem nezhodnocuje.</w:t>
-      </w:r>
-    </w:p>
-    <w:p>
-      <w:pPr>
-        <w:pStyle w:val="Text"/>
-        <w:rPr>
-          <w:rFonts w:ascii="Arial Narrow" w:eastAsia="Helvetica Neue Thin" w:hAnsi="Arial Narrow" w:cs="Arial"/>
-          <w:sz w:val="16"/>
-          <w:szCs w:val="16"/>
-        </w:rPr>
-      </w:pPr>
-    </w:p>
-    <w:p>
-      <w:pPr>
-        <w:pStyle w:val="Nadpis"/>
-        <w:numPr>
-          <w:ilvl w:val="0"/>
-          <w:numId w:val="16"/>
-        </w:numPr>
-        <w:rPr>
-          <w:rFonts w:ascii="Arial Narrow" w:hAnsi="Arial Narrow" w:cs="Arial"/>
-          <w:b w:val="0"/>
-          <w:bCs w:val="0"/>
           <w:u w:val="single"/>
         </w:rPr>
       </w:pPr>
@@ -4817,8 +4788,6 @@
       <w:r>
         <w:rPr>
           <w:rFonts w:ascii="Arial Narrow" w:eastAsia="Arial Unicode MS" w:hAnsi="Arial Narrow" w:cs="Arial"/>
-          <w:b w:val="0"/>
-          <w:bCs w:val="0"/>
           <w:u w:val="single"/>
         </w:rPr>
         <w:t>Salvatorní</w:t>
@@ -4827,8 +4796,6 @@
       <w:r>
         <w:rPr>
           <w:rFonts w:ascii="Arial Narrow" w:eastAsia="Arial Unicode MS" w:hAnsi="Arial Narrow" w:cs="Arial"/>
-          <w:b w:val="0"/>
-          <w:bCs w:val="0"/>
           <w:u w:val="single"/>
         </w:rPr>
         <w:t xml:space="preserve"> klauzule</w:t>
@@ -5062,7 +5029,7 @@
         <w:pStyle w:val="Text"/>
         <w:numPr>
           <w:ilvl w:val="0"/>
-          <w:numId w:val="20"/>
+          <w:numId w:val="40"/>
         </w:numPr>
         <w:jc w:val="both"/>
         <w:rPr>
@@ -5085,7 +5052,7 @@
         <w:pStyle w:val="Text"/>
         <w:numPr>
           <w:ilvl w:val="0"/>
-          <w:numId w:val="20"/>
+          <w:numId w:val="40"/>
         </w:numPr>
         <w:jc w:val="both"/>
         <w:rPr>
@@ -5108,7 +5075,7 @@
         <w:pStyle w:val="Text"/>
         <w:numPr>
           <w:ilvl w:val="0"/>
-          <w:numId w:val="20"/>
+          <w:numId w:val="40"/>
         </w:numPr>
         <w:jc w:val="both"/>
         <w:rPr>
@@ -5131,7 +5098,7 @@
         <w:pStyle w:val="Text"/>
         <w:numPr>
           <w:ilvl w:val="0"/>
-          <w:numId w:val="20"/>
+          <w:numId w:val="40"/>
         </w:numPr>
         <w:jc w:val="both"/>
         <w:rPr>
@@ -5154,7 +5121,7 @@
         <w:pStyle w:val="Text"/>
         <w:numPr>
           <w:ilvl w:val="0"/>
-          <w:numId w:val="20"/>
+          <w:numId w:val="40"/>
         </w:numPr>
         <w:jc w:val="both"/>
         <w:rPr>
@@ -5209,7 +5176,7 @@
         <w:pStyle w:val="Text"/>
         <w:numPr>
           <w:ilvl w:val="0"/>
-          <w:numId w:val="20"/>
+          <w:numId w:val="40"/>
         </w:numPr>
         <w:jc w:val="both"/>
         <w:rPr>
@@ -6007,9 +5974,8 @@
         <w:spacing w:after="60"/>
         <w:jc w:val="both"/>
         <w:rPr>
-          <w:rFonts w:ascii="Arial Narrow" w:eastAsia="Helvetica Neue Thin" w:hAnsi="Arial Narrow" w:cs="Arial"/>
-          <w:sz w:val="16"/>
-          <w:szCs w:val="16"/>
+          <w:rFonts w:ascii="Arial Narrow" w:hAnsi="Arial Narrow" w:cs="Arial"/>
+          <w:sz w:val="16"/>
         </w:rPr>
       </w:pPr>
       <w:r>
@@ -6034,6 +6000,38 @@
           <w:highlight w:val="yellow"/>
         </w:rPr>
         <w:t>Marie Ryšková</w:t>
+      </w:r>
+    </w:p>
+    <w:p>
+      <w:pPr>
+        <w:pStyle w:val="Vchoz"/>
+        <w:tabs>
+          <w:tab w:val="center" w:pos="2835"/>
+          <w:tab w:val="center" w:pos="7937"/>
+        </w:tabs>
+        <w:spacing w:after="60"/>
+        <w:jc w:val="both"/>
+        <w:rPr>
+          <w:rFonts w:ascii="Arial Narrow" w:eastAsia="Helvetica Neue Thin" w:hAnsi="Arial Narrow" w:cs="Arial"/>
+          <w:sz w:val="16"/>
+          <w:szCs w:val="16"/>
+        </w:rPr>
+      </w:pPr>
+      <w:r>
+        <w:rPr>
+          <w:rFonts w:ascii="Arial Narrow" w:hAnsi="Arial Narrow" w:cs="Arial"/>
+          <w:sz w:val="16"/>
+        </w:rPr>
+        <w:tab/>
+        <w:t>CALAMARI SE</w:t>
+      </w:r>
+      <w:r>
+        <w:rPr>
+          <w:rFonts w:ascii="Arial Narrow" w:hAnsi="Arial Narrow" w:cs="Arial"/>
+          <w:sz w:val="16"/>
+        </w:rPr>
+        <w:tab/>
+        <w:t>název nájemce</w:t>
       </w:r>
     </w:p>
     <w:p>
@@ -6638,7 +6636,15 @@
         <w:szCs w:val="16"/>
       </w:rPr>
       <w:tab/>
-      <w:t>CALAMARI SE / Andělé Stromu života p. s.</w:t>
+      <w:t xml:space="preserve">CALAMARI SE / </w:t>
+    </w:r>
+    <w:r>
+      <w:rPr>
+        <w:rFonts w:ascii="Arial Narrow" w:hAnsi="Arial Narrow"/>
+        <w:sz w:val="16"/>
+        <w:szCs w:val="16"/>
+      </w:rPr>
+      <w:t>nájemce</w:t>
     </w:r>
   </w:p>
 </w:hdr>
@@ -6889,6 +6895,236 @@
     <w:numStyleLink w:val="sla"/>
   </w:abstractNum>
   <w:abstractNum w:abstractNumId="3" w15:restartNumberingAfterBreak="0">
+    <w:nsid w:val="34921633"/>
+    <w:multiLevelType w:val="hybridMultilevel"/>
+    <w:tmpl w:val="A67EB782"/>
+    <w:lvl w:ilvl="0" w:tplc="FFFFFFFF">
+      <w:start w:val="1"/>
+      <w:numFmt w:val="upperLetter"/>
+      <w:lvlText w:val="(%1)"/>
+      <w:lvlJc w:val="left"/>
+      <w:pPr>
+        <w:ind w:left="567" w:hanging="283"/>
+      </w:pPr>
+      <w:rPr>
+        <w:rFonts w:hAnsi="Arial Unicode MS"/>
+        <w:caps w:val="0"/>
+        <w:smallCaps w:val="0"/>
+        <w:strike w:val="0"/>
+        <w:dstrike w:val="0"/>
+        <w:outline w:val="0"/>
+        <w:emboss w:val="0"/>
+        <w:imprint w:val="0"/>
+        <w:spacing w:val="0"/>
+        <w:w w:val="100"/>
+        <w:kern w:val="0"/>
+        <w:position w:val="0"/>
+        <w:highlight w:val="none"/>
+        <w:vertAlign w:val="baseline"/>
+      </w:rPr>
+    </w:lvl>
+    <w:lvl w:ilvl="1" w:tplc="FFFFFFFF">
+      <w:start w:val="1"/>
+      <w:numFmt w:val="upperLetter"/>
+      <w:lvlText w:val="%2."/>
+      <w:lvlJc w:val="left"/>
+      <w:pPr>
+        <w:ind w:left="622" w:hanging="262"/>
+      </w:pPr>
+      <w:rPr>
+        <w:rFonts w:hAnsi="Arial Unicode MS"/>
+        <w:caps w:val="0"/>
+        <w:smallCaps w:val="0"/>
+        <w:strike w:val="0"/>
+        <w:dstrike w:val="0"/>
+        <w:outline w:val="0"/>
+        <w:emboss w:val="0"/>
+        <w:imprint w:val="0"/>
+        <w:spacing w:val="0"/>
+        <w:w w:val="100"/>
+        <w:kern w:val="0"/>
+        <w:position w:val="0"/>
+        <w:highlight w:val="none"/>
+        <w:vertAlign w:val="baseline"/>
+      </w:rPr>
+    </w:lvl>
+    <w:lvl w:ilvl="2" w:tplc="FFFFFFFF">
+      <w:start w:val="1"/>
+      <w:numFmt w:val="upperLetter"/>
+      <w:lvlText w:val="%3."/>
+      <w:lvlJc w:val="left"/>
+      <w:pPr>
+        <w:ind w:left="982" w:hanging="262"/>
+      </w:pPr>
+      <w:rPr>
+        <w:rFonts w:hAnsi="Arial Unicode MS"/>
+        <w:caps w:val="0"/>
+        <w:smallCaps w:val="0"/>
+        <w:strike w:val="0"/>
+        <w:dstrike w:val="0"/>
+        <w:outline w:val="0"/>
+        <w:emboss w:val="0"/>
+        <w:imprint w:val="0"/>
+        <w:spacing w:val="0"/>
+        <w:w w:val="100"/>
+        <w:kern w:val="0"/>
+        <w:position w:val="0"/>
+        <w:highlight w:val="none"/>
+        <w:vertAlign w:val="baseline"/>
+      </w:rPr>
+    </w:lvl>
+    <w:lvl w:ilvl="3" w:tplc="FFFFFFFF">
+      <w:start w:val="1"/>
+      <w:numFmt w:val="upperLetter"/>
+      <w:lvlText w:val="%4."/>
+      <w:lvlJc w:val="left"/>
+      <w:pPr>
+        <w:ind w:left="1342" w:hanging="262"/>
+      </w:pPr>
+      <w:rPr>
+        <w:rFonts w:hAnsi="Arial Unicode MS"/>
+        <w:caps w:val="0"/>
+        <w:smallCaps w:val="0"/>
+        <w:strike w:val="0"/>
+        <w:dstrike w:val="0"/>
+        <w:outline w:val="0"/>
+        <w:emboss w:val="0"/>
+        <w:imprint w:val="0"/>
+        <w:spacing w:val="0"/>
+        <w:w w:val="100"/>
+        <w:kern w:val="0"/>
+        <w:position w:val="0"/>
+        <w:highlight w:val="none"/>
+        <w:vertAlign w:val="baseline"/>
+      </w:rPr>
+    </w:lvl>
+    <w:lvl w:ilvl="4" w:tplc="FFFFFFFF">
+      <w:start w:val="1"/>
+      <w:numFmt w:val="upperLetter"/>
+      <w:lvlText w:val="%5."/>
+      <w:lvlJc w:val="left"/>
+      <w:pPr>
+        <w:ind w:left="1702" w:hanging="262"/>
+      </w:pPr>
+      <w:rPr>
+        <w:rFonts w:hAnsi="Arial Unicode MS"/>
+        <w:caps w:val="0"/>
+        <w:smallCaps w:val="0"/>
+        <w:strike w:val="0"/>
+        <w:dstrike w:val="0"/>
+        <w:outline w:val="0"/>
+        <w:emboss w:val="0"/>
+        <w:imprint w:val="0"/>
+        <w:spacing w:val="0"/>
+        <w:w w:val="100"/>
+        <w:kern w:val="0"/>
+        <w:position w:val="0"/>
+        <w:highlight w:val="none"/>
+        <w:vertAlign w:val="baseline"/>
+      </w:rPr>
+    </w:lvl>
+    <w:lvl w:ilvl="5" w:tplc="FFFFFFFF">
+      <w:start w:val="1"/>
+      <w:numFmt w:val="upperLetter"/>
+      <w:lvlText w:val="%6."/>
+      <w:lvlJc w:val="left"/>
+      <w:pPr>
+        <w:ind w:left="2062" w:hanging="262"/>
+      </w:pPr>
+      <w:rPr>
+        <w:rFonts w:hAnsi="Arial Unicode MS"/>
+        <w:caps w:val="0"/>
+        <w:smallCaps w:val="0"/>
+        <w:strike w:val="0"/>
+        <w:dstrike w:val="0"/>
+        <w:outline w:val="0"/>
+        <w:emboss w:val="0"/>
+        <w:imprint w:val="0"/>
+        <w:spacing w:val="0"/>
+        <w:w w:val="100"/>
+        <w:kern w:val="0"/>
+        <w:position w:val="0"/>
+        <w:highlight w:val="none"/>
+        <w:vertAlign w:val="baseline"/>
+      </w:rPr>
+    </w:lvl>
+    <w:lvl w:ilvl="6" w:tplc="FFFFFFFF">
+      <w:start w:val="1"/>
+      <w:numFmt w:val="upperLetter"/>
+      <w:lvlText w:val="%7."/>
+      <w:lvlJc w:val="left"/>
+      <w:pPr>
+        <w:ind w:left="2422" w:hanging="262"/>
+      </w:pPr>
+      <w:rPr>
+        <w:rFonts w:hAnsi="Arial Unicode MS"/>
+        <w:caps w:val="0"/>
+        <w:smallCaps w:val="0"/>
+        <w:strike w:val="0"/>
+        <w:dstrike w:val="0"/>
+        <w:outline w:val="0"/>
+        <w:emboss w:val="0"/>
+        <w:imprint w:val="0"/>
+        <w:spacing w:val="0"/>
+        <w:w w:val="100"/>
+        <w:kern w:val="0"/>
+        <w:position w:val="0"/>
+        <w:highlight w:val="none"/>
+        <w:vertAlign w:val="baseline"/>
+      </w:rPr>
+    </w:lvl>
+    <w:lvl w:ilvl="7" w:tplc="FFFFFFFF">
+      <w:start w:val="1"/>
+      <w:numFmt w:val="upperLetter"/>
+      <w:lvlText w:val="%8."/>
+      <w:lvlJc w:val="left"/>
+      <w:pPr>
+        <w:ind w:left="2782" w:hanging="262"/>
+      </w:pPr>
+      <w:rPr>
+        <w:rFonts w:hAnsi="Arial Unicode MS"/>
+        <w:caps w:val="0"/>
+        <w:smallCaps w:val="0"/>
+        <w:strike w:val="0"/>
+        <w:dstrike w:val="0"/>
+        <w:outline w:val="0"/>
+        <w:emboss w:val="0"/>
+        <w:imprint w:val="0"/>
+        <w:spacing w:val="0"/>
+        <w:w w:val="100"/>
+        <w:kern w:val="0"/>
+        <w:position w:val="0"/>
+        <w:highlight w:val="none"/>
+        <w:vertAlign w:val="baseline"/>
+      </w:rPr>
+    </w:lvl>
+    <w:lvl w:ilvl="8" w:tplc="FFFFFFFF">
+      <w:start w:val="1"/>
+      <w:numFmt w:val="upperLetter"/>
+      <w:lvlText w:val="%9."/>
+      <w:lvlJc w:val="left"/>
+      <w:pPr>
+        <w:ind w:left="3142" w:hanging="262"/>
+      </w:pPr>
+      <w:rPr>
+        <w:rFonts w:hAnsi="Arial Unicode MS"/>
+        <w:caps w:val="0"/>
+        <w:smallCaps w:val="0"/>
+        <w:strike w:val="0"/>
+        <w:dstrike w:val="0"/>
+        <w:outline w:val="0"/>
+        <w:emboss w:val="0"/>
+        <w:imprint w:val="0"/>
+        <w:spacing w:val="0"/>
+        <w:w w:val="100"/>
+        <w:kern w:val="0"/>
+        <w:position w:val="0"/>
+        <w:highlight w:val="none"/>
+        <w:vertAlign w:val="baseline"/>
+      </w:rPr>
+    </w:lvl>
+  </w:abstractNum>
+  <w:abstractNum w:abstractNumId="4" w15:restartNumberingAfterBreak="0">
     <w:nsid w:val="35663A58"/>
     <w:multiLevelType w:val="multilevel"/>
     <w:tmpl w:val="C7ACABDA"/>
@@ -7118,7 +7354,7 @@
       </w:rPr>
     </w:lvl>
   </w:abstractNum>
-  <w:abstractNum w:abstractNumId="4" w15:restartNumberingAfterBreak="0">
+  <w:abstractNum w:abstractNumId="5" w15:restartNumberingAfterBreak="0">
     <w:nsid w:val="3A1C79F7"/>
     <w:multiLevelType w:val="hybridMultilevel"/>
     <w:tmpl w:val="AC3E6CF2"/>
@@ -7367,7 +7603,7 @@
       </w:rPr>
     </w:lvl>
   </w:abstractNum>
-  <w:abstractNum w:abstractNumId="5" w15:restartNumberingAfterBreak="0">
+  <w:abstractNum w:abstractNumId="6" w15:restartNumberingAfterBreak="0">
     <w:nsid w:val="3E8E02BE"/>
     <w:multiLevelType w:val="hybridMultilevel"/>
     <w:tmpl w:val="C7ACABDA"/>
@@ -7598,7 +7834,7 @@
       </w:rPr>
     </w:lvl>
   </w:abstractNum>
-  <w:abstractNum w:abstractNumId="6" w15:restartNumberingAfterBreak="0">
+  <w:abstractNum w:abstractNumId="7" w15:restartNumberingAfterBreak="0">
     <w:nsid w:val="3FC825AB"/>
     <w:multiLevelType w:val="hybridMultilevel"/>
     <w:tmpl w:val="A67EB782"/>
@@ -7829,7 +8065,7 @@
       </w:rPr>
     </w:lvl>
   </w:abstractNum>
-  <w:abstractNum w:abstractNumId="7" w15:restartNumberingAfterBreak="0">
+  <w:abstractNum w:abstractNumId="8" w15:restartNumberingAfterBreak="0">
     <w:nsid w:val="44B22278"/>
     <w:multiLevelType w:val="hybridMultilevel"/>
     <w:tmpl w:val="29CA90FE"/>
@@ -8060,19 +8296,19 @@
       </w:rPr>
     </w:lvl>
   </w:abstractNum>
-  <w:abstractNum w:abstractNumId="8" w15:restartNumberingAfterBreak="0">
+  <w:abstractNum w:abstractNumId="9" w15:restartNumberingAfterBreak="0">
     <w:nsid w:val="51805A8A"/>
     <w:multiLevelType w:val="multilevel"/>
     <w:tmpl w:val="C7ACABDA"/>
     <w:numStyleLink w:val="Harvard"/>
   </w:abstractNum>
-  <w:abstractNum w:abstractNumId="9" w15:restartNumberingAfterBreak="0">
+  <w:abstractNum w:abstractNumId="10" w15:restartNumberingAfterBreak="0">
     <w:nsid w:val="5454684E"/>
     <w:multiLevelType w:val="hybridMultilevel"/>
     <w:tmpl w:val="29CA90FE"/>
     <w:numStyleLink w:val="Odrka"/>
   </w:abstractNum>
-  <w:abstractNum w:abstractNumId="10" w15:restartNumberingAfterBreak="0">
+  <w:abstractNum w:abstractNumId="11" w15:restartNumberingAfterBreak="0">
     <w:nsid w:val="79847DAC"/>
     <w:multiLevelType w:val="hybridMultilevel"/>
     <w:tmpl w:val="E474F6AA"/>
@@ -8321,130 +8557,130 @@
     </w:lvl>
   </w:abstractNum>
   <w:num w:numId="1" w16cid:durableId="1960604592">
-    <w:abstractNumId w:val="10"/>
+    <w:abstractNumId w:val="11"/>
   </w:num>
   <w:num w:numId="2" w16cid:durableId="1492408875">
-    <w:abstractNumId w:val="10"/>
+    <w:abstractNumId w:val="11"/>
     <w:lvlOverride w:ilvl="0">
       <w:startOverride w:val="2"/>
     </w:lvlOverride>
   </w:num>
   <w:num w:numId="3" w16cid:durableId="63920951">
-    <w:abstractNumId w:val="10"/>
+    <w:abstractNumId w:val="11"/>
     <w:lvlOverride w:ilvl="0">
       <w:startOverride w:val="3"/>
     </w:lvlOverride>
   </w:num>
   <w:num w:numId="4" w16cid:durableId="1485008932">
-    <w:abstractNumId w:val="10"/>
+    <w:abstractNumId w:val="11"/>
     <w:lvlOverride w:ilvl="0">
       <w:startOverride w:val="4"/>
     </w:lvlOverride>
   </w:num>
   <w:num w:numId="5" w16cid:durableId="1687250384">
-    <w:abstractNumId w:val="10"/>
+    <w:abstractNumId w:val="11"/>
     <w:lvlOverride w:ilvl="0">
       <w:startOverride w:val="5"/>
     </w:lvlOverride>
   </w:num>
   <w:num w:numId="6" w16cid:durableId="1285041006">
-    <w:abstractNumId w:val="10"/>
+    <w:abstractNumId w:val="11"/>
     <w:lvlOverride w:ilvl="0">
       <w:startOverride w:val="6"/>
     </w:lvlOverride>
   </w:num>
   <w:num w:numId="7" w16cid:durableId="1638876952">
-    <w:abstractNumId w:val="10"/>
+    <w:abstractNumId w:val="11"/>
     <w:lvlOverride w:ilvl="0">
       <w:startOverride w:val="7"/>
     </w:lvlOverride>
   </w:num>
   <w:num w:numId="8" w16cid:durableId="1287274279">
-    <w:abstractNumId w:val="10"/>
+    <w:abstractNumId w:val="11"/>
     <w:lvlOverride w:ilvl="0">
       <w:startOverride w:val="8"/>
     </w:lvlOverride>
   </w:num>
   <w:num w:numId="9" w16cid:durableId="1656715683">
-    <w:abstractNumId w:val="10"/>
+    <w:abstractNumId w:val="11"/>
     <w:lvlOverride w:ilvl="0">
       <w:startOverride w:val="9"/>
     </w:lvlOverride>
   </w:num>
   <w:num w:numId="10" w16cid:durableId="620763746">
-    <w:abstractNumId w:val="10"/>
+    <w:abstractNumId w:val="11"/>
     <w:lvlOverride w:ilvl="0">
       <w:startOverride w:val="10"/>
     </w:lvlOverride>
   </w:num>
   <w:num w:numId="11" w16cid:durableId="323363425">
-    <w:abstractNumId w:val="10"/>
+    <w:abstractNumId w:val="11"/>
     <w:lvlOverride w:ilvl="0">
       <w:startOverride w:val="11"/>
     </w:lvlOverride>
   </w:num>
   <w:num w:numId="12" w16cid:durableId="1967351070">
-    <w:abstractNumId w:val="10"/>
+    <w:abstractNumId w:val="11"/>
     <w:lvlOverride w:ilvl="0">
       <w:startOverride w:val="12"/>
     </w:lvlOverride>
   </w:num>
   <w:num w:numId="13" w16cid:durableId="1807352472">
-    <w:abstractNumId w:val="10"/>
+    <w:abstractNumId w:val="11"/>
     <w:lvlOverride w:ilvl="0">
       <w:startOverride w:val="13"/>
     </w:lvlOverride>
   </w:num>
   <w:num w:numId="14" w16cid:durableId="1073897170">
-    <w:abstractNumId w:val="10"/>
+    <w:abstractNumId w:val="11"/>
     <w:lvlOverride w:ilvl="0">
       <w:startOverride w:val="14"/>
     </w:lvlOverride>
   </w:num>
   <w:num w:numId="15" w16cid:durableId="1084568869">
-    <w:abstractNumId w:val="4"/>
+    <w:abstractNumId w:val="5"/>
   </w:num>
   <w:num w:numId="16" w16cid:durableId="2077776993">
     <w:abstractNumId w:val="2"/>
   </w:num>
   <w:num w:numId="17" w16cid:durableId="116148958">
-    <w:abstractNumId w:val="5"/>
+    <w:abstractNumId w:val="6"/>
   </w:num>
   <w:num w:numId="18" w16cid:durableId="1063986987">
-    <w:abstractNumId w:val="8"/>
+    <w:abstractNumId w:val="9"/>
   </w:num>
   <w:num w:numId="19" w16cid:durableId="1788036583">
-    <w:abstractNumId w:val="6"/>
+    <w:abstractNumId w:val="7"/>
   </w:num>
   <w:num w:numId="20" w16cid:durableId="1324507962">
     <w:abstractNumId w:val="0"/>
   </w:num>
   <w:num w:numId="21" w16cid:durableId="1629626114">
-    <w:abstractNumId w:val="8"/>
+    <w:abstractNumId w:val="9"/>
     <w:lvlOverride w:ilvl="0">
       <w:startOverride w:val="1"/>
     </w:lvlOverride>
   </w:num>
   <w:num w:numId="22" w16cid:durableId="1076167748">
-    <w:abstractNumId w:val="8"/>
+    <w:abstractNumId w:val="9"/>
     <w:lvlOverride w:ilvl="0">
       <w:startOverride w:val="1"/>
     </w:lvlOverride>
   </w:num>
   <w:num w:numId="23" w16cid:durableId="749273866">
-    <w:abstractNumId w:val="8"/>
+    <w:abstractNumId w:val="9"/>
     <w:lvlOverride w:ilvl="0">
       <w:startOverride w:val="1"/>
     </w:lvlOverride>
   </w:num>
   <w:num w:numId="24" w16cid:durableId="1113210659">
-    <w:abstractNumId w:val="8"/>
+    <w:abstractNumId w:val="9"/>
     <w:lvlOverride w:ilvl="0">
       <w:startOverride w:val="1"/>
     </w:lvlOverride>
   </w:num>
   <w:num w:numId="25" w16cid:durableId="758716248">
-    <w:abstractNumId w:val="8"/>
+    <w:abstractNumId w:val="9"/>
     <w:lvlOverride w:ilvl="0">
       <w:startOverride w:val="1"/>
     </w:lvlOverride>
@@ -8462,25 +8698,25 @@
     </w:lvlOverride>
   </w:num>
   <w:num w:numId="28" w16cid:durableId="1145272480">
-    <w:abstractNumId w:val="8"/>
+    <w:abstractNumId w:val="9"/>
     <w:lvlOverride w:ilvl="0">
       <w:startOverride w:val="1"/>
     </w:lvlOverride>
   </w:num>
   <w:num w:numId="29" w16cid:durableId="628556067">
-    <w:abstractNumId w:val="8"/>
+    <w:abstractNumId w:val="9"/>
     <w:lvlOverride w:ilvl="0">
       <w:startOverride w:val="1"/>
     </w:lvlOverride>
   </w:num>
   <w:num w:numId="30" w16cid:durableId="1614436108">
-    <w:abstractNumId w:val="8"/>
+    <w:abstractNumId w:val="9"/>
     <w:lvlOverride w:ilvl="0">
       <w:startOverride w:val="1"/>
     </w:lvlOverride>
   </w:num>
   <w:num w:numId="31" w16cid:durableId="2033916904">
-    <w:abstractNumId w:val="8"/>
+    <w:abstractNumId w:val="9"/>
     <w:lvlOverride w:ilvl="0">
       <w:startOverride w:val="1"/>
     </w:lvlOverride>
@@ -8492,34 +8728,37 @@
     </w:lvlOverride>
   </w:num>
   <w:num w:numId="33" w16cid:durableId="1803184841">
-    <w:abstractNumId w:val="8"/>
+    <w:abstractNumId w:val="9"/>
     <w:lvlOverride w:ilvl="0">
       <w:startOverride w:val="1"/>
     </w:lvlOverride>
   </w:num>
   <w:num w:numId="34" w16cid:durableId="1983000412">
-    <w:abstractNumId w:val="8"/>
+    <w:abstractNumId w:val="9"/>
     <w:lvlOverride w:ilvl="0">
       <w:startOverride w:val="1"/>
     </w:lvlOverride>
   </w:num>
   <w:num w:numId="35" w16cid:durableId="976688431">
-    <w:abstractNumId w:val="8"/>
+    <w:abstractNumId w:val="9"/>
     <w:lvlOverride w:ilvl="0">
       <w:startOverride w:val="1"/>
     </w:lvlOverride>
   </w:num>
   <w:num w:numId="36" w16cid:durableId="1699694405">
-    <w:abstractNumId w:val="7"/>
+    <w:abstractNumId w:val="8"/>
   </w:num>
   <w:num w:numId="37" w16cid:durableId="1057779333">
-    <w:abstractNumId w:val="9"/>
+    <w:abstractNumId w:val="10"/>
   </w:num>
   <w:num w:numId="38" w16cid:durableId="324819629">
-    <w:abstractNumId w:val="3"/>
+    <w:abstractNumId w:val="4"/>
   </w:num>
   <w:num w:numId="39" w16cid:durableId="802120606">
     <w:abstractNumId w:val="1"/>
+  </w:num>
+  <w:num w:numId="40" w16cid:durableId="1674063230">
+    <w:abstractNumId w:val="3"/>
   </w:num>
 </w:numbering>
 </file>

</xml_diff>

<commit_message>
Smlouva čl. 11: odstranit rozhodčí doložku
Co-Authored-By: Claude Sonnet 5 <noreply@anthropic.com>
</commit_message>
<xml_diff>
--- a/core/contract_templates/smlouva_template.docx
+++ b/core/contract_templates/smlouva_template.docx
@@ -2989,7 +2989,6 @@
           <w:rFonts w:ascii="Arial Narrow" w:eastAsia="Arial Unicode MS" w:hAnsi="Arial Narrow" w:cs="Arial"/>
           <w:u w:val="single"/>
         </w:rPr>
-        <w:lastRenderedPageBreak/>
         <w:t>Splatnost a způsob placení nájemného a cen služeb</w:t>
       </w:r>
       <w:bookmarkEnd w:id="3"/>
@@ -3737,6 +3736,7 @@
           <w:sz w:val="16"/>
           <w:szCs w:val="16"/>
         </w:rPr>
+        <w:lastRenderedPageBreak/>
         <w:t>Smluvní strany ujednávají, že nájemce je oprávněn vůči pohledávkám pronajímatele jednostranně započíst pouze ty své pohledávky, které mu byly přiznány pravomocným soudním či správním rozhodnutím.</w:t>
       </w:r>
     </w:p>
@@ -3760,7 +3760,6 @@
           <w:sz w:val="16"/>
           <w:szCs w:val="16"/>
         </w:rPr>
-        <w:lastRenderedPageBreak/>
         <w:t>Smluvní strany se zavazují, že nebudou sdělovat podmínky nájmu třetím osobám.</w:t>
       </w:r>
     </w:p>
@@ -4235,7 +4234,43 @@
           <w:sz w:val="16"/>
           <w:szCs w:val="16"/>
         </w:rPr>
-        <w:t>Pronajímatel však může tuto smlouvu vypovědět s výpovědní dobou v trvání 14 dnů ode dne doručení výpovědi nájemci z důvodů, že nájemce porušuje kterékoli z ustanovení odst. 5.2, 5.3, 5.4, 5.9, 5.13, 5.15, 5.17, 6.1 nebo 6.2 nebo že se nájemce dostal do prodlení delšího než 14 dnů s jakýmkoli peněžitým plněním podle Smlouvy nebo že nájemce nebo třetí osoby užívají Předmět nájmu způsobem odporujícím veřejnému pořádku nebo že bylo zahájeno proti nájemci jako dlužníkovi insolvenční řízení podle zákona č. 182/2006 Sb., insolvenčního zákona, ve znění pozdějších předpisů. V případě výpovědi dle tohoto písmene se ustanovení písmene (B) nepoužije.</w:t>
+        <w:t xml:space="preserve">Pronajímatel však může tuto smlouvu vypovědět s </w:t>
+      </w:r>
+      <w:r>
+        <w:rPr>
+          <w:rFonts w:ascii="Arial Narrow" w:hAnsi="Arial Narrow" w:cs="Arial"/>
+          <w:b/>
+          <w:bCs/>
+          <w:sz w:val="16"/>
+          <w:szCs w:val="16"/>
+        </w:rPr>
+        <w:t>výpovědní dobou v trvání 14 dnů</w:t>
+      </w:r>
+      <w:r>
+        <w:rPr>
+          <w:rFonts w:ascii="Arial Narrow" w:hAnsi="Arial Narrow" w:cs="Arial"/>
+          <w:sz w:val="16"/>
+          <w:szCs w:val="16"/>
+        </w:rPr>
+        <w:t xml:space="preserve"> ode dne doručení výpovědi nájemci z důvodů, že nájemce porušuje kterékoli z ustanovení odst. 5.2, 5.3, 5.4, 5.9, 5.13, 5.15, 5.17, 6.1 nebo 6.2 nebo že se nájemce dostal do </w:t>
+      </w:r>
+      <w:r>
+        <w:rPr>
+          <w:rFonts w:ascii="Arial Narrow" w:hAnsi="Arial Narrow" w:cs="Arial"/>
+          <w:b/>
+          <w:bCs/>
+          <w:sz w:val="16"/>
+          <w:szCs w:val="16"/>
+        </w:rPr>
+        <w:t>prodlení delšího než 14 dnů</w:t>
+      </w:r>
+      <w:r>
+        <w:rPr>
+          <w:rFonts w:ascii="Arial Narrow" w:hAnsi="Arial Narrow" w:cs="Arial"/>
+          <w:sz w:val="16"/>
+          <w:szCs w:val="16"/>
+        </w:rPr>
+        <w:t xml:space="preserve"> s jakýmkoli peněžitým plněním podle Smlouvy nebo že nájemce nebo třetí osoby užívají Předmět nájmu způsobem odporujícím veřejnému pořádku nebo že bylo zahájeno proti nájemci jako dlužníkovi insolvenční řízení podle zákona č. 182/2006 Sb., insolvenčního zákona, ve znění pozdějších předpisů. V případě výpovědi dle tohoto písmene se ustanovení písmene (B) nepoužije.</w:t>
       </w:r>
     </w:p>
     <w:p>
@@ -4778,7 +4813,15 @@
           <w:rFonts w:ascii="Arial Narrow" w:hAnsi="Arial Narrow" w:cs="Arial"/>
           <w:sz w:val="16"/>
         </w:rPr>
-        <w:t>. Kauce je určena k zajištění pohledávek, jež by mohly pronajímateli vzniknout vůči nájemci za trvání této Smlouvy, zejména pohledávek z titulu nájemného, cen poskytovaných služeb, náhrady škody, smluvních pokut a úroků z prodlení. Pronajímatel je oprávněn čerpat kauci k uspokojení těchto svých nároků, pokud se nájemce dostane do prodlení s jejich placením; o čerpání kauce pronajímatel nájemce písemně informuje. Nájemce je povinen bez zbytečného odkladu, nejpozději však do 3 dnů od doručení oznámení pronajímatele o čerpání kauce a jeho rozsahu, doplnit kauci do původní výše. Složená kauce bude nájemci vrácena do 15 dnů od skončení nájemního vztahu podle Smlouvy. Pokud však dojde ke sporu ohledně nároků vyplývajících z této Smlouvy, je pronajímatel povinen vrátit kauci do 15 dnů od účinnosti dohody o vypořádání těchto sporných nároků nebo od právní moci rozhodnutí soudu ve věci. Pronajímatel je oprávněn před vrácením kauce započíst oproti kauci veškeré své pohledávky za nájemcem. Pronajímatel není v žádném případě povinen vrátit nájemci poskytnutou kauci nebo její část, zbývající po započtení pohledávek pronajímatele, dokud nájemce nesplní svou povinnost vrátit pronajímateli Předmět nájmu včetně příslušenství v takovém stavu, v jakém mu byl předán (s ohledem k běžnému opotřebení). Kauce se neúročí ani jiným způsobem nezhodnocuje.</w:t>
+        <w:t xml:space="preserve">. Kauce je určena k zajištění pohledávek, jež by mohly pronajímateli vzniknout vůči nájemci za trvání této Smlouvy, zejména pohledávek z titulu nájemného, cen poskytovaných služeb, náhrady škody, smluvních pokut a úroků z prodlení. Pronajímatel je oprávněn čerpat kauci k uspokojení těchto svých nároků, pokud se nájemce dostane do prodlení s jejich placením; o čerpání kauce pronajímatel nájemce písemně informuje. Nájemce je povinen bez zbytečného odkladu, nejpozději však do 3 dnů od doručení oznámení pronajímatele o čerpání kauce a jeho rozsahu, doplnit kauci do původní výše. Složená kauce bude nájemci vrácena do 15 dnů od skončení nájemního vztahu podle Smlouvy. Pokud však dojde ke sporu ohledně nároků vyplývajících z této Smlouvy, je pronajímatel povinen vrátit kauci do 15 dnů od účinnosti dohody o vypořádání těchto sporných nároků nebo od právní moci rozhodnutí soudu ve věci. Pronajímatel je oprávněn před vrácením kauce započíst oproti kauci veškeré své pohledávky za nájemcem. Pronajímatel není v žádném případě povinen vrátit nájemci poskytnutou kauci nebo její část, zbývající po započtení pohledávek pronajímatele, </w:t>
+      </w:r>
+      <w:r>
+        <w:rPr>
+          <w:rFonts w:ascii="Arial Narrow" w:hAnsi="Arial Narrow" w:cs="Arial"/>
+          <w:sz w:val="16"/>
+        </w:rPr>
+        <w:lastRenderedPageBreak/>
+        <w:t>dokud nájemce nesplní svou povinnost vrátit pronajímateli Předmět nájmu včetně příslušenství v takovém stavu, v jakém mu byl předán (s ohledem k běžnému opotřebení). Kauce se neúročí ani jiným způsobem nezhodnocuje.</w:t>
       </w:r>
     </w:p>
     <w:p>
@@ -4944,280 +4987,6 @@
     <w:p>
       <w:pPr>
         <w:pStyle w:val="Text"/>
-        <w:numPr>
-          <w:ilvl w:val="0"/>
-          <w:numId w:val="31"/>
-        </w:numPr>
-        <w:jc w:val="both"/>
-        <w:rPr>
-          <w:rFonts w:ascii="Arial Narrow" w:hAnsi="Arial Narrow" w:cs="Arial"/>
-          <w:sz w:val="16"/>
-          <w:szCs w:val="16"/>
-        </w:rPr>
-      </w:pPr>
-      <w:r>
-        <w:rPr>
-          <w:rFonts w:ascii="Arial Narrow" w:hAnsi="Arial Narrow" w:cs="Arial"/>
-          <w:sz w:val="16"/>
-          <w:szCs w:val="16"/>
-        </w:rPr>
-        <w:t xml:space="preserve">Smluvní strany se výslovně dohodly na tom, že veškeré majetkové spory mezi nimi, které vzniknou z této smlouvy, jakož i z právních vztahů z ní vyplývajících či s ní souvisejících, a které mohou být dle obecně závazných právních předpisů rozhodovány v rozhodčím řízení, budou rozhodovány s konečnou platností v rozhodčím řízení, a to jedním rozhodcem, kterým strany určují Mgr. Davida </w:t>
-      </w:r>
-      <w:proofErr w:type="spellStart"/>
-      <w:r>
-        <w:rPr>
-          <w:rFonts w:ascii="Arial Narrow" w:hAnsi="Arial Narrow" w:cs="Arial"/>
-          <w:sz w:val="16"/>
-          <w:szCs w:val="16"/>
-        </w:rPr>
-        <w:t>Purmenského</w:t>
-      </w:r>
-      <w:proofErr w:type="spellEnd"/>
-      <w:r>
-        <w:rPr>
-          <w:rFonts w:ascii="Arial Narrow" w:hAnsi="Arial Narrow" w:cs="Arial"/>
-          <w:sz w:val="16"/>
-          <w:szCs w:val="16"/>
-        </w:rPr>
-        <w:t xml:space="preserve">, advokáta zapsaného v seznamu advokátů ČAK pod č. 10171, se sídlem Ostrava – Moravská Ostrava, 28. října 3117/61, PSČ 702 00. Pro případ, že se takto určený rozhodce vzdá funkce rozhodce nebo nemůže činnost rozhodce vykonávat, určují smluvní strany náhradním jediným rozhodcem Mgr. Michala Machka, advokáta zapsaného v seznamu advokátů ČAK pod č. 4802, se sídlem Ostrava – Moravská Ostrava, Dlouhá 53/6, PSČ 702 00. </w:t>
-      </w:r>
-    </w:p>
-    <w:p>
-      <w:pPr>
-        <w:pStyle w:val="Text"/>
-        <w:numPr>
-          <w:ilvl w:val="0"/>
-          <w:numId w:val="31"/>
-        </w:numPr>
-        <w:jc w:val="both"/>
-        <w:rPr>
-          <w:rFonts w:ascii="Arial Narrow" w:hAnsi="Arial Narrow" w:cs="Arial"/>
-          <w:sz w:val="16"/>
-          <w:szCs w:val="16"/>
-        </w:rPr>
-      </w:pPr>
-      <w:r>
-        <w:rPr>
-          <w:rFonts w:ascii="Arial Narrow" w:hAnsi="Arial Narrow" w:cs="Arial"/>
-          <w:sz w:val="16"/>
-          <w:szCs w:val="16"/>
-        </w:rPr>
-        <w:t>V souladu s ustanovením § 19 odst. 1 zákona č. 216/1994 Sb. se smluvní strany výslovně dohodly na těchto pravidlech rozhodčího řízení:</w:t>
-      </w:r>
-    </w:p>
-    <w:p>
-      <w:pPr>
-        <w:pStyle w:val="Text"/>
-        <w:numPr>
-          <w:ilvl w:val="0"/>
-          <w:numId w:val="32"/>
-        </w:numPr>
-        <w:jc w:val="both"/>
-        <w:rPr>
-          <w:rFonts w:ascii="Arial Narrow" w:hAnsi="Arial Narrow" w:cs="Arial"/>
-          <w:sz w:val="16"/>
-          <w:szCs w:val="16"/>
-        </w:rPr>
-      </w:pPr>
-      <w:r>
-        <w:rPr>
-          <w:rFonts w:ascii="Arial Narrow" w:hAnsi="Arial Narrow" w:cs="Arial"/>
-          <w:sz w:val="16"/>
-          <w:szCs w:val="16"/>
-        </w:rPr>
-        <w:t>Smluvní strany se dohodly na tom, že v otázkách pravidel tohoto řízení, jež nejsou výslovně upravena v této rozhodčí smlouvě, pověřují určeného rozhodce přiměřeně použít pro projednání a rozhodnutí tohoto sporu zákon č. 99/1963 Sb., občanský soudní řád, v platném znění (dále jen „o. s. ř.</w:t>
-      </w:r>
-      <w:r>
-        <w:rPr>
-          <w:rFonts w:ascii="Arial Narrow" w:hAnsi="Arial Narrow" w:cs="Arial"/>
-          <w:sz w:val="16"/>
-          <w:szCs w:val="16"/>
-          <w:rtl/>
-        </w:rPr>
-        <w:t>“</w:t>
-      </w:r>
-      <w:r>
-        <w:rPr>
-          <w:rFonts w:ascii="Arial Narrow" w:hAnsi="Arial Narrow" w:cs="Arial"/>
-          <w:sz w:val="16"/>
-          <w:szCs w:val="16"/>
-        </w:rPr>
-        <w:t xml:space="preserve">), a zákon č. 216/1994 Sb., o rozhodčím řízení a o výkonu rozhodčích nálezů, v platném znění. </w:t>
-      </w:r>
-    </w:p>
-    <w:p>
-      <w:pPr>
-        <w:pStyle w:val="Text"/>
-        <w:numPr>
-          <w:ilvl w:val="0"/>
-          <w:numId w:val="40"/>
-        </w:numPr>
-        <w:jc w:val="both"/>
-        <w:rPr>
-          <w:rFonts w:ascii="Arial Narrow" w:hAnsi="Arial Narrow" w:cs="Arial"/>
-          <w:sz w:val="16"/>
-          <w:szCs w:val="16"/>
-        </w:rPr>
-      </w:pPr>
-      <w:r>
-        <w:rPr>
-          <w:rFonts w:ascii="Arial Narrow" w:hAnsi="Arial Narrow" w:cs="Arial"/>
-          <w:sz w:val="16"/>
-          <w:szCs w:val="16"/>
-        </w:rPr>
-        <w:t>Žaloba se podává k rozhodci a doručuje se na adresu rozhodce, uvedenou v předchozím odstavci tohoto článku této smlouvy. Rozhodčí řízení je zahájeno okamžikem doručení žaloby rozhodci. Rozhodce uvědomí o podání žaloby žalovaného, kterému zašle kopii žaloby s příslušnými písemnostmi. Současně rozhodce vyzve žalovaného, aby do 10 dnů od doručení žaloby předložil k této žalobě své písemné vyjádření doložené důkazy, jichž se žalovaný dovolává. Tím není dotčeno právo žalovaného požádat rozhodce o prodloužení této lhůty. V případě, že tak žalovaný neučiní, považují se skutečnosti uvedené v žalobě za nesporné a nárok, který je žalobcem uplatňován, žalovaný tímto uznává.</w:t>
-      </w:r>
-    </w:p>
-    <w:p>
-      <w:pPr>
-        <w:pStyle w:val="Text"/>
-        <w:numPr>
-          <w:ilvl w:val="0"/>
-          <w:numId w:val="40"/>
-        </w:numPr>
-        <w:jc w:val="both"/>
-        <w:rPr>
-          <w:rFonts w:ascii="Arial Narrow" w:hAnsi="Arial Narrow" w:cs="Arial"/>
-          <w:sz w:val="16"/>
-          <w:szCs w:val="16"/>
-        </w:rPr>
-      </w:pPr>
-      <w:r>
-        <w:rPr>
-          <w:rFonts w:ascii="Arial Narrow" w:hAnsi="Arial Narrow" w:cs="Arial"/>
-          <w:sz w:val="16"/>
-          <w:szCs w:val="16"/>
-        </w:rPr>
-        <w:t xml:space="preserve">Smluvní strany se dohodly, že pro doručování písemností v rozhodčím řízení, a to včetně rozhodčího nálezu, užije rozhodce přiměřeně o. s. ř. Adresami pro doručování v rámci rozhodčího řízení (ve smyslu ustanovení § 46a o. s. ř.) jsou adresy uvedené v záhlaví této smlouvy, pokud si smluvní strany nesdělí prokazatelným způsobem jinou adresu, na niž má být doručeno, nebo pokud některá ze smluvních stran nesdělí ve smyslu ustanovení § 46a o. s. ř. v průběhu rozhodčího řízení určenému rozhodci jinou adresu pro doručování. </w:t>
-      </w:r>
-    </w:p>
-    <w:p>
-      <w:pPr>
-        <w:pStyle w:val="Text"/>
-        <w:numPr>
-          <w:ilvl w:val="0"/>
-          <w:numId w:val="40"/>
-        </w:numPr>
-        <w:jc w:val="both"/>
-        <w:rPr>
-          <w:rFonts w:ascii="Arial Narrow" w:hAnsi="Arial Narrow" w:cs="Arial"/>
-          <w:sz w:val="16"/>
-          <w:szCs w:val="16"/>
-        </w:rPr>
-      </w:pPr>
-      <w:r>
-        <w:rPr>
-          <w:rFonts w:ascii="Arial Narrow" w:hAnsi="Arial Narrow" w:cs="Arial"/>
-          <w:sz w:val="16"/>
-          <w:szCs w:val="16"/>
-        </w:rPr>
-        <w:t>Smluvní strany se dohodly, že spor bude rozhodcem rozhodován zásadně bez ústního jednání na základě písemných důkazů předložených stranami. Nebude-li rozhodce považovat písemné důkazy za dostačující, je oprávněn ústní jednání nařídit. Rozhodce také nařídí ústní jednání v případě, pokud to alespoň jedna ze smluvních stran navrhne při prvním písemném úkonu ve věci samé. O čase a místě konání ústního jednání vyrozumí rozhodce strany předvoláním. Jednací místo je v sídle rozhodce zapsaném v seznamu advokátů ČAK.</w:t>
-      </w:r>
-    </w:p>
-    <w:p>
-      <w:pPr>
-        <w:pStyle w:val="Text"/>
-        <w:numPr>
-          <w:ilvl w:val="0"/>
-          <w:numId w:val="40"/>
-        </w:numPr>
-        <w:jc w:val="both"/>
-        <w:rPr>
-          <w:rFonts w:ascii="Arial Narrow" w:hAnsi="Arial Narrow" w:cs="Arial"/>
-          <w:sz w:val="16"/>
-          <w:szCs w:val="16"/>
-        </w:rPr>
-      </w:pPr>
-      <w:r>
-        <w:rPr>
-          <w:rFonts w:ascii="Arial Narrow" w:hAnsi="Arial Narrow" w:cs="Arial"/>
-          <w:sz w:val="16"/>
-          <w:szCs w:val="16"/>
-        </w:rPr>
-        <w:t xml:space="preserve">Rozhodčí řízení je rozhodcem vedeno zásadně neveřejně, pokud se smluvní strany výslovně nedohodnou jinak. Rozhodčí řízení dle této smlouvy je po dohodě smluvních stran jednoinstanční a pravomocný rozhodčí nález je vykonatelný. </w:t>
-      </w:r>
-    </w:p>
-    <w:p>
-      <w:pPr>
-        <w:pStyle w:val="Text"/>
-        <w:numPr>
-          <w:ilvl w:val="0"/>
-          <w:numId w:val="40"/>
-        </w:numPr>
-        <w:jc w:val="both"/>
-        <w:rPr>
-          <w:rFonts w:ascii="Arial Narrow" w:hAnsi="Arial Narrow" w:cs="Arial"/>
-          <w:sz w:val="16"/>
-          <w:szCs w:val="16"/>
-        </w:rPr>
-      </w:pPr>
-      <w:r>
-        <w:rPr>
-          <w:rFonts w:ascii="Arial Narrow" w:hAnsi="Arial Narrow" w:cs="Arial"/>
-          <w:sz w:val="16"/>
-          <w:szCs w:val="16"/>
-        </w:rPr>
-        <w:t xml:space="preserve">Poplatek za rozhodčí řízení je povinen zaplatit žalobce při podání žaloby a žalovaný při podání vzájemné žaloby nebo námitky započtení na výzvu rozhodce. Výše poplatku činí </w:t>
-      </w:r>
-      <w:r>
-        <w:rPr>
-          <w:rFonts w:ascii="Arial Narrow" w:hAnsi="Arial Narrow" w:cs="Arial"/>
-          <w:sz w:val="16"/>
-          <w:szCs w:val="16"/>
-        </w:rPr>
-        <w:t>5.000 Kč</w:t>
-      </w:r>
-      <w:r>
-        <w:rPr>
-          <w:rFonts w:ascii="Arial Narrow" w:hAnsi="Arial Narrow" w:cs="Arial"/>
-          <w:sz w:val="16"/>
-          <w:szCs w:val="16"/>
-        </w:rPr>
-        <w:t xml:space="preserve"> ze základu poplatku, nejméně však 5.000</w:t>
-      </w:r>
-      <w:r>
-        <w:rPr>
-          <w:rFonts w:ascii="Arial Narrow" w:hAnsi="Arial Narrow" w:cs="Arial"/>
-          <w:sz w:val="16"/>
-          <w:szCs w:val="16"/>
-        </w:rPr>
-        <w:t xml:space="preserve"> </w:t>
-      </w:r>
-      <w:r>
-        <w:rPr>
-          <w:rFonts w:ascii="Arial Narrow" w:hAnsi="Arial Narrow" w:cs="Arial"/>
-          <w:sz w:val="16"/>
-          <w:szCs w:val="16"/>
-        </w:rPr>
-        <w:t>Kč; takto stanovený poplatek bude navýšen o DPH. Smluvní strany se výslovně dohodly, že v otázce způsobu výpočtu základu poplatku pro stanovení výše rozhodčího poplatku a v dalších otázkách týkajících se rozhodčího poplatku rozhodce určený pro rozhodnutí sporu přiměřeně použije zákon č. 549/1991 Sb., o soudních poplatcích, v platném znění.</w:t>
-      </w:r>
-    </w:p>
-    <w:p>
-      <w:pPr>
-        <w:pStyle w:val="Text"/>
-        <w:numPr>
-          <w:ilvl w:val="0"/>
-          <w:numId w:val="40"/>
-        </w:numPr>
-        <w:jc w:val="both"/>
-        <w:rPr>
-          <w:rFonts w:ascii="Arial Narrow" w:hAnsi="Arial Narrow" w:cs="Arial"/>
-          <w:sz w:val="16"/>
-          <w:szCs w:val="16"/>
-        </w:rPr>
-      </w:pPr>
-      <w:r>
-        <w:rPr>
-          <w:rFonts w:ascii="Arial Narrow" w:hAnsi="Arial Narrow" w:cs="Arial"/>
-          <w:sz w:val="16"/>
-          <w:szCs w:val="16"/>
-        </w:rPr>
-        <w:t>Předpokládané náklady účastníků rozhodčího řízení jsou rozhodčí poplatek, hotové výdaje účastníků a jejich zástupců, náklady důkazů a odměna za zastupování. Odměna rozhodce je zahrnuta v rozhodčím poplatku. V případě, že některá ze smluvních stran bude ve sporu zastoupena advokátem (právním zástupcem), rozhodce při výpočtu výše odměny za zastupování (nákladů právního zastoupení) postupuje v souladu s vyhláškou č. 177/1996 Sb., v platném znění. Účastníku, který měl ve věci plný úspěch, přizná rozhodce náhradu nákladů potřebných k účelnému uplatňování nebo bránění práva proti účastníku, který ve věci úspěch neměl. V dalších otázkách nákladů řízení se rozhodce řídí přiměřeně o. s. ř.</w:t>
-      </w:r>
-    </w:p>
-    <w:p>
-      <w:pPr>
-        <w:pStyle w:val="Text"/>
         <w:rPr>
           <w:rFonts w:ascii="Arial Narrow" w:eastAsia="Helvetica Neue Thin" w:hAnsi="Arial Narrow" w:cs="Arial"/>
           <w:sz w:val="16"/>
@@ -5672,7 +5441,6 @@
           <w:sz w:val="16"/>
           <w:szCs w:val="16"/>
         </w:rPr>
-        <w:lastRenderedPageBreak/>
         <w:t>Strany této smlouvy shodně konstatují, že si nepřejí, aby nad rámec výslovných ustanovení této smlouvy byla jakákoli práva a povinnosti dovozovány z dosavadní či budoucí praxe zavedené mezi stranami či zvyklostí zachovávaných obecně či v odvětví týkajícím se předmětu plnění této smlouvy, ledaže je ve smlouvě výslovně sjednáno jinak. Nadto strany této smlouvy prohlašují a vzájemně si potvrzují, že si nejsou vědomy žádných dosud mezi nimi zavedených obchodních zvyklostí či praxe.</w:t>
       </w:r>
     </w:p>

</xml_diff>

<commit_message>
Smlouva: nahradit reálná data konkrétního klienta viditelnými placeholdery v šabloně
core/contract_templates/smlouva_template.docx dřív obsahovala skutečné
údaje klienta Andělé Stromu života (název, sídlo, IČ, zástupce, e-mail)
i konkrétní příkladové hodnoty (data, částky, výpovědní lhůtu) - při
přímém otevření šablony ve Wordu to působilo jako už vyplněná smlouva.
Nahrazeno placeholdery ve tvaru [NÁZEV_POLE] na všech místech, kam se
dosazují údaje z DB. contract_generator.py upraven, aby tyto nové
placeholdery hledal místo starých hodnot.

Co-Authored-By: Claude Sonnet 5 <noreply@anthropic.com>
</commit_message>
<xml_diff>
--- a/core/contract_templates/smlouva_template.docx
+++ b/core/contract_templates/smlouva_template.docx
@@ -425,7 +425,7 @@
           <w:sz w:val="16"/>
           <w:highlight w:val="yellow"/>
         </w:rPr>
-        <w:t>Andělé Stromu života p. s.</w:t>
+        <w:t>[NÁZEV NÁJEMCE]</w:t>
       </w:r>
     </w:p>
     <w:p>
@@ -450,7 +450,7 @@
           <w:sz w:val="16"/>
           <w:highlight w:val="yellow"/>
         </w:rPr>
-        <w:t>Kostelní 71/37, 74101 Nový Jičín</w:t>
+        <w:t>[ADRESA NÁJEMCE]</w:t>
       </w:r>
     </w:p>
     <w:p>
@@ -475,7 +475,7 @@
           <w:sz w:val="16"/>
           <w:highlight w:val="yellow"/>
         </w:rPr>
-        <w:t>03632661</w:t>
+        <w:t>[IČ NÁJEMCE]</w:t>
       </w:r>
     </w:p>
     <w:p>
@@ -517,7 +517,7 @@
           <w:sz w:val="16"/>
           <w:highlight w:val="yellow"/>
         </w:rPr>
-        <w:t>Krajským soudem v Ostravě</w:t>
+        <w:t>[SOUD]</w:t>
       </w:r>
       <w:r>
         <w:rPr>
@@ -532,7 +532,7 @@
           <w:sz w:val="16"/>
           <w:highlight w:val="yellow"/>
         </w:rPr>
-        <w:t>L</w:t>
+        <w:t>[ODDÍL]</w:t>
       </w:r>
       <w:r>
         <w:rPr>
@@ -547,7 +547,7 @@
           <w:sz w:val="16"/>
           <w:highlight w:val="yellow"/>
         </w:rPr>
-        <w:t>14601</w:t>
+        <w:t>[VLOŽKA]</w:t>
       </w:r>
     </w:p>
     <w:p>
@@ -572,7 +572,7 @@
           <w:sz w:val="16"/>
           <w:highlight w:val="yellow"/>
         </w:rPr>
-        <w:t>Marie Ryšková</w:t>
+        <w:t>[ZÁSTUPCE NÁJEMCE]</w:t>
       </w:r>
       <w:r>
         <w:rPr>
@@ -587,7 +587,7 @@
           <w:sz w:val="16"/>
           <w:highlight w:val="yellow"/>
         </w:rPr>
-        <w:t>ředitelka</w:t>
+        <w:t>[FUNKCE ZÁSTUPCE]</w:t>
       </w:r>
     </w:p>
     <w:p>
@@ -615,7 +615,7 @@
             <w:highlight w:val="yellow"/>
             <w:u w:val="single"/>
           </w:rPr>
-          <w:t>info@zivotastrom.cz</w:t>
+          <w:t>[EMAIL PRO FAKTURACI]</w:t>
         </w:r>
       </w:hyperlink>
     </w:p>
@@ -2358,7 +2358,7 @@
           <w:sz w:val="16"/>
           <w:highlight w:val="yellow"/>
         </w:rPr>
-        <w:t>30. července 2026</w:t>
+        <w:t>[DATUM VÝPISU Z OR]</w:t>
       </w:r>
       <w:r>
         <w:rPr>
@@ -2717,7 +2717,7 @@
           <w:sz w:val="16"/>
           <w:highlight w:val="yellow"/>
         </w:rPr>
-        <w:t>1. ledna 2027.</w:t>
+        <w:t>[DATUM ZVÝŠENÍ NÁJEMNÉHO].</w:t>
       </w:r>
     </w:p>
     <w:p>
@@ -3505,7 +3505,7 @@
           <w:sz w:val="16"/>
           <w:highlight w:val="yellow"/>
         </w:rPr>
-        <w:t>50 000 Kč</w:t>
+        <w:t>[POJISTNÁ ČÁSTKA]</w:t>
       </w:r>
       <w:r>
         <w:rPr>
@@ -4137,7 +4137,7 @@
           <w:highlight w:val="yellow"/>
           <w:u w:val="single"/>
         </w:rPr>
-        <w:t>1. srpna 2026</w:t>
+        <w:t>[DATUM PLATNOSTI SMLOUVY]</w:t>
       </w:r>
       <w:r>
         <w:rPr>
@@ -4211,7 +4211,7 @@
           <w:sz w:val="16"/>
           <w:szCs w:val="16"/>
         </w:rPr>
-        <w:t xml:space="preserve">Pronajímatel i nájemce mohou kdykoli Smlouvu vypovědět i bez udání důvodu. Výpovědní doba činí u výpovědi pronajímatele i nájemce shodně 3 měsíce a její běh začíná prvním dnem kalendářního měsíce bezprostředně následujícího po doručení výpovědi druhé smluvní straně. </w:t>
+        <w:t xml:space="preserve">Pronajímatel i nájemce mohou kdykoli Smlouvu vypovědět i bez udání důvodu. Výpovědní doba činí u výpovědi pronajímatele i nájemce shodně [VÝPOVĚDNÍ LHŮTA] a její běh začíná prvním dnem kalendářního měsíce bezprostředně následujícího po doručení výpovědi druhé smluvní straně. </w:t>
       </w:r>
     </w:p>
     <w:p>
@@ -4806,7 +4806,7 @@
           <w:sz w:val="16"/>
           <w:highlight w:val="yellow"/>
         </w:rPr>
-        <w:t>15 000 Kč</w:t>
+        <w:t>[VÝŠE KAUCE]</w:t>
       </w:r>
       <w:r>
         <w:rPr>
@@ -5545,7 +5545,7 @@
           <w:sz w:val="16"/>
           <w:highlight w:val="yellow"/>
         </w:rPr>
-        <w:t>30. července 2026</w:t>
+        <w:t>[DATUM PODPISU]</w:t>
       </w:r>
     </w:p>
     <w:p>
@@ -5788,7 +5788,7 @@
           <w:sz w:val="16"/>
           <w:highlight w:val="yellow"/>
         </w:rPr>
-        <w:t>Marie Ryšková</w:t>
+        <w:t>[ZÁSTUPCE NÁJEMCE]</w:t>
       </w:r>
     </w:p>
     <w:p>

</xml_diff>

<commit_message>
Smlouva: podpora doby určité v čl. 7 (Trvání Smlouvy)
Sablona ted obsahuje dve varianty odst. 7.1 (na dobu neurcitou / na dobu
urcitou "do [DATUM]"), obe se stejnym cislovanim - podle Contract.valid_to
se ta nepouzita pred generovanim smaze. U smlouvy na dobu urcitou navic
mizi odst. 7.2 pism. b) "vypoved bez udani duvodu" (na pevnem konci
nedava smysl) a s nim i navazujici odkaz na "pismene (B)" v puvodnim
pism. c), ktere se tak stane novym pism. b).

Pole Neurčitá/Určitá a Platnost do uz v adminu existovala (ContractAdminForm),
zmena je jen v generovani dokumentu.

Co-Authored-By: Claude Sonnet 5 <noreply@anthropic.com>
</commit_message>
<xml_diff>
--- a/core/contract_templates/smlouva_template.docx
+++ b/core/contract_templates/smlouva_template.docx
@@ -4138,6 +4138,76 @@
           <w:u w:val="single"/>
         </w:rPr>
         <w:t>[DATUM PLATNOSTI SMLOUVY]</w:t>
+      </w:r>
+      <w:r>
+        <w:rPr>
+          <w:rFonts w:ascii="Arial Narrow" w:hAnsi="Arial Narrow" w:cs="Arial"/>
+          <w:sz w:val="16"/>
+        </w:rPr>
+        <w:t xml:space="preserve">. </w:t>
+      </w:r>
+    </w:p>
+    <w:p>
+      <w:pPr>
+        <w:pStyle w:val="Text"/>
+        <w:numPr>
+          <w:ilvl w:val="0"/>
+          <w:numId w:val="25"/>
+        </w:numPr>
+        <w:jc w:val="both"/>
+        <w:rPr>
+          <w:rFonts w:ascii="Arial Narrow" w:hAnsi="Arial Narrow" w:cs="Arial"/>
+          <w:sz w:val="16"/>
+          <w:szCs w:val="16"/>
+        </w:rPr>
+      </w:pPr>
+      <w:r>
+        <w:rPr>
+          <w:rFonts w:ascii="Arial Narrow" w:hAnsi="Arial Narrow" w:cs="Arial"/>
+          <w:sz w:val="16"/>
+        </w:rPr>
+        <w:t xml:space="preserve">Smluvní strany se dohodly, že nájem dle této Smlouvy se sjednává na dobu </w:t>
+      </w:r>
+      <w:r>
+        <w:rPr>
+          <w:rFonts w:ascii="Arial Narrow" w:hAnsi="Arial Narrow" w:cs="Arial"/>
+          <w:b/>
+          <w:bCs/>
+          <w:sz w:val="16"/>
+        </w:rPr>
+        <w:t>určitou</w:t>
+      </w:r>
+      <w:r>
+        <w:rPr>
+          <w:rFonts w:ascii="Arial Narrow" w:hAnsi="Arial Narrow" w:cs="Arial"/>
+          <w:sz w:val="16"/>
+        </w:rPr>
+        <w:t xml:space="preserve">, a to od </w:t>
+      </w:r>
+      <w:r>
+        <w:rPr>
+          <w:rFonts w:ascii="Arial Narrow" w:hAnsi="Arial Narrow" w:cs="Arial"/>
+          <w:sz w:val="16"/>
+          <w:highlight w:val="yellow"/>
+          <w:u w:val="single"/>
+        </w:rPr>
+        <w:t>[DATUM PLATNOSTI SMLOUVY]</w:t>
+      </w:r>
+      <w:r>
+        <w:rPr>
+          <w:rFonts w:ascii="Arial Narrow" w:hAnsi="Arial Narrow" w:cs="Arial"/>
+          <w:sz w:val="16"/>
+        </w:rPr>
+        <w:t xml:space="preserve"> do </w:t>
+      </w:r>
+      <w:r>
+        <w:rPr>
+          <w:rFonts w:ascii="Arial Narrow" w:hAnsi="Arial Narrow" w:cs="Arial"/>
+          <w:sz w:val="16"/>
+          <w:highlight w:val="yellow"/>
+          <w:u w:val="single"/>
+        </w:rPr>
+        <w:t>[DATUM UKONČENÍ SMLOUVY]</w:t>
       </w:r>
       <w:r>
         <w:rPr>

</xml_diff>